<commit_message>
docs: finalize ClaimTrace submission and verified evidence
</commit_message>
<xml_diff>
--- a/docs/BUSINESS_TECHNICAL_TRADEOFF_EN.docx
+++ b/docs/BUSINESS_TECHNICAL_TRADEOFF_EN.docx
@@ -9,9 +9,11 @@
       <w:r>
         <w:rPr>
           <w:rFonts w:ascii="Times New Roman" w:hAnsi="Times New Roman" w:eastAsia="Times New Roman"/>
-          <w:sz w:val="24"/>
+          <w:b/>
+          <w:color w:val="000000"/>
+          <w:sz w:val="38"/>
         </w:rPr>
-        <w:t>ClaimTrace Business and Technical Trade-off Analysis</w:t>
+        <w:t>ClaimTrace Business and Technical Tradeoff Analysis</w:t>
       </w:r>
     </w:p>
     <w:p>
@@ -19,9 +21,10 @@
       <w:r>
         <w:rPr>
           <w:rFonts w:ascii="Times New Roman" w:hAnsi="Times New Roman" w:eastAsia="Times New Roman"/>
+          <w:color w:val="000000"/>
           <w:sz w:val="24"/>
         </w:rPr>
-        <w:t>ClaimTrace is a working prototype for screening Chinese e-commerce product claims. Its current evidence does not meet the proposal's 80% recall target for high-risk and evidence-needed claims combined: observed recall is 68% on the locked 30-item set. The prototype can surface claims for review, but it cannot approve copy or replace a human decision.</w:t>
+        <w:t>Miao Jiaxuan | PE6201</w:t>
       </w:r>
     </w:p>
     <w:p>
@@ -31,7 +34,9 @@
       <w:r>
         <w:rPr>
           <w:rFonts w:ascii="Times New Roman" w:hAnsi="Times New Roman" w:eastAsia="Times New Roman"/>
-          <w:sz w:val="24"/>
+          <w:b/>
+          <w:color w:val="000000"/>
+          <w:sz w:val="28"/>
         </w:rPr>
         <w:t>Problem and intended users</w:t>
       </w:r>
@@ -41,9 +46,10 @@
       <w:r>
         <w:rPr>
           <w:rFonts w:ascii="Times New Roman" w:hAnsi="Times New Roman" w:eastAsia="Times New Roman"/>
+          <w:color w:val="000000"/>
           <w:sz w:val="24"/>
         </w:rPr>
-        <w:t>ClaimTrace is designed for small e-commerce sellers preparing Chinese product-page copy. The narrower assumption that some lack in-house compliance support has not been validated through seller interviews. In my previous copy-editing work, I checked claims against a company prohibited-words list before a supervisor reviewed them. I recall spending one to three minutes per item, but did not time it; this is personal context, not seller research or measured savings.</w:t>
+        <w:t>ClaimTrace screens Chinese e-commerce advertising claims for small sellers. It combines a rule baseline, related enforcement cases and a model-generated risk card in one interface. The prototype improves access to contextual evidence, but its combined risk-detection recall of 68% falls short of the proposal's 80% target. This limits its usefulness as an automated screening system.</w:t>
       </w:r>
     </w:p>
     <w:p>
@@ -51,23 +57,21 @@
       <w:r>
         <w:rPr>
           <w:rFonts w:ascii="Times New Roman" w:hAnsi="Times New Roman" w:eastAsia="Times New Roman"/>
+          <w:color w:val="000000"/>
           <w:sz w:val="24"/>
         </w:rPr>
-        <w:t xml:space="preserve">The prototype retrieves related public enforcement cases and returns a preliminary risk card. It can flag potentially risky claims, including cure or disease-prevention claims, but does not provide legal, medical, financial or other professional advice. </w:t>
+        <w:t>The problem comes from my previous product-copy editing work. I checked text against a company prohibited-words list, followed by a supervisor's review. I recall spending one to three minutes per item; this was not timed. Small sellers are the intended users, not an interviewed or validated customer segment. The proposed benefit is easier evidence assembly before human review, rather than proven time savings or replacement of that review.</w:t>
       </w:r>
-      <w:r>
-        <w:rPr>
-          <w:rFonts w:ascii="Consolas" w:hAnsi="Consolas" w:eastAsia="Consolas"/>
-          <w:sz w:val="21"/>
-        </w:rPr>
-        <w:t>low_risk</w:t>
-      </w:r>
+    </w:p>
+    <w:p>
+      <w:pPr/>
       <w:r>
         <w:rPr>
           <w:rFonts w:ascii="Times New Roman" w:hAnsi="Times New Roman" w:eastAsia="Times New Roman"/>
+          <w:color w:val="000000"/>
           <w:sz w:val="24"/>
         </w:rPr>
-        <w:t xml:space="preserve"> is not legal approval; publication still requires human review. A review prompt does not create a ticket or assign a reviewer.</w:t>
+        <w:t>Users enter one Chinese claim and receive a screening label, reasoning and retrieved evidence, or an insufficient-evidence response. The tool can identify dangerous medical-effect advertising in ordinary product copy, but offers no professional advice. Low risk is not legal approval, and publication requires human confirmation. A human-review prompt does not assign a reviewer or create a ticket.</w:t>
       </w:r>
     </w:p>
     <w:p>
@@ -77,7 +81,9 @@
       <w:r>
         <w:rPr>
           <w:rFonts w:ascii="Times New Roman" w:hAnsi="Times New Roman" w:eastAsia="Times New Roman"/>
-          <w:sz w:val="24"/>
+          <w:b/>
+          <w:color w:val="000000"/>
+          <w:sz w:val="28"/>
         </w:rPr>
         <w:t>Build versus buy and technical choices</w:t>
       </w:r>
@@ -87,9 +93,10 @@
       <w:r>
         <w:rPr>
           <w:rFonts w:ascii="Times New Roman" w:hAnsi="Times New Roman" w:eastAsia="Times New Roman"/>
+          <w:color w:val="000000"/>
           <w:sz w:val="24"/>
         </w:rPr>
-        <w:t>I built the Streamlit workflow, rules, retrieval, threshold handling, response validation and evaluation, while reusing Python libraries, a multilingual embedder and a hosted model through OpenRouter. This avoids training and hosting a foundation model, but retains service, corpus and human-verification dependencies.</w:t>
+        <w:t>I built the Streamlit workflow, keyword rules, retrieval orchestration, response validation and evaluation. I reused Python libraries, multilingual embeddings and a hosted foundation model through OpenRouter. Buying model inference avoids training and hosting a language model, but introduces external-service dependence and requires scrutiny of generated reasoning.</w:t>
       </w:r>
     </w:p>
     <w:p>
@@ -97,65 +104,10 @@
       <w:r>
         <w:rPr>
           <w:rFonts w:ascii="Times New Roman" w:hAnsi="Times New Roman" w:eastAsia="Times New Roman"/>
+          <w:color w:val="000000"/>
           <w:sz w:val="24"/>
         </w:rPr>
-        <w:t xml:space="preserve">The retriever uses </w:t>
-      </w:r>
-      <w:r>
-        <w:rPr>
-          <w:rFonts w:ascii="Consolas" w:hAnsi="Consolas" w:eastAsia="Consolas"/>
-          <w:sz w:val="21"/>
-        </w:rPr>
-        <w:t>sentence-transformers/paraphrase-multilingual-MiniLM-L12-v2</w:t>
-      </w:r>
-      <w:r>
-        <w:rPr>
-          <w:rFonts w:ascii="Times New Roman" w:hAnsi="Times New Roman" w:eastAsia="Times New Roman"/>
-          <w:sz w:val="24"/>
-        </w:rPr>
-        <w:t xml:space="preserve"> with cosine similarity instead of the proposal's English-trained </w:t>
-      </w:r>
-      <w:r>
-        <w:rPr>
-          <w:rFonts w:ascii="Consolas" w:hAnsi="Consolas" w:eastAsia="Consolas"/>
-          <w:sz w:val="21"/>
-        </w:rPr>
-        <w:t>all-MiniLM-L6-v2</w:t>
-      </w:r>
-      <w:r>
-        <w:rPr>
-          <w:rFonts w:ascii="Times New Roman" w:hAnsi="Times New Roman" w:eastAsia="Times New Roman"/>
-          <w:sz w:val="24"/>
-        </w:rPr>
-        <w:t xml:space="preserve"> and FAISS plan (</w:t>
-      </w:r>
-      <w:r>
-        <w:rPr>
-          <w:rFonts w:ascii="Consolas" w:hAnsi="Consolas" w:eastAsia="Consolas"/>
-          <w:sz w:val="21"/>
-        </w:rPr>
-        <w:t>src/retrieval.py</w:t>
-      </w:r>
-      <w:r>
-        <w:rPr>
-          <w:rFonts w:ascii="Times New Roman" w:hAnsi="Times New Roman" w:eastAsia="Times New Roman"/>
-          <w:sz w:val="24"/>
-        </w:rPr>
-        <w:t>; original problem statement). Its model card describes multilingual embeddings, not ClaimTrace quality (Sentence Transformers, n.d.). In a selected ten-query development audit, the top case ID matched the expected ID in 7/10 queries, while reviewers judged all ten relevant and supportive of a risk reminder; this is not a general accuracy estimate (</w:t>
-      </w:r>
-      <w:r>
-        <w:rPr>
-          <w:rFonts w:ascii="Consolas" w:hAnsi="Consolas" w:eastAsia="Consolas"/>
-          <w:sz w:val="21"/>
-        </w:rPr>
-        <w:t>evaluation/retrieval_audit_10.csv</w:t>
-      </w:r>
-      <w:r>
-        <w:rPr>
-          <w:rFonts w:ascii="Times New Roman" w:hAnsi="Times New Roman" w:eastAsia="Times New Roman"/>
-          <w:sz w:val="24"/>
-        </w:rPr>
-        <w:t>).</w:t>
+        <w:t>The current retriever uses paraphrase-multilingual-MiniLM-L12-v2 and cosine similarity (src/retrieval.py). This addresses the teacher's concern about the proposal's English-trained MiniLM over Chinese text. The model card describes multilingual support, not performance on this project (Sentence Transformers, n.d.). With only 30 case records, direct cosine ranking is sufficient for this prototype; FAISS would add infrastructure without a demonstrated requirement. I did not train a classifier or implement an agent because the task follows a fixed retrieval-and-assessment sequence.</w:t>
       </w:r>
     </w:p>
     <w:p>
@@ -163,79 +115,21 @@
       <w:r>
         <w:rPr>
           <w:rFonts w:ascii="Times New Roman" w:hAnsi="Times New Roman" w:eastAsia="Times New Roman"/>
+          <w:color w:val="000000"/>
           <w:sz w:val="24"/>
         </w:rPr>
-        <w:t>The uncalibrated 0.30 threshold abstains below the score and permits one model call at or above it; it is not an illegality probability (</w:t>
+        <w:t>A selected audit reused saved retrieval results for ten Chinese development queries. Seven top-ranked case IDs matched the expected IDs; all ten were manually judged relevant and supportive of a risk reminder (evaluation/retrieval_audit_10.csv). A different ID is not necessarily irrelevant. However, this small, selected audit is neither a controlled embedding comparison nor a general retrieval-accuracy estimate.</w:t>
       </w:r>
-      <w:r>
-        <w:rPr>
-          <w:rFonts w:ascii="Consolas" w:hAnsi="Consolas" w:eastAsia="Consolas"/>
-          <w:sz w:val="21"/>
-        </w:rPr>
-        <w:t>src/risk_pipeline.py</w:t>
-      </w:r>
+    </w:p>
+    <w:p>
+      <w:pPr/>
       <w:r>
         <w:rPr>
           <w:rFonts w:ascii="Times New Roman" w:hAnsi="Times New Roman" w:eastAsia="Times New Roman"/>
+          <w:color w:val="000000"/>
           <w:sz w:val="24"/>
         </w:rPr>
-        <w:t>). Schema validation checks structure, not factual truth. I did not implement FAISS, train a classifier or build an agent: the workflow is a fixed sequence, and an independent LLM judge remained an optional proposal. The twenty completed reviews were human reviews, not an LLM judge (</w:t>
-      </w:r>
-      <w:r>
-        <w:rPr>
-          <w:rFonts w:ascii="Consolas" w:hAnsi="Consolas" w:eastAsia="Consolas"/>
-          <w:sz w:val="21"/>
-        </w:rPr>
-        <w:t>src/schemas.py</w:t>
-      </w:r>
-      <w:r>
-        <w:rPr>
-          <w:rFonts w:ascii="Times New Roman" w:hAnsi="Times New Roman" w:eastAsia="Times New Roman"/>
-          <w:sz w:val="24"/>
-        </w:rPr>
-        <w:t xml:space="preserve">; </w:t>
-      </w:r>
-      <w:r>
-        <w:rPr>
-          <w:rFonts w:ascii="Consolas" w:hAnsi="Consolas" w:eastAsia="Consolas"/>
-          <w:sz w:val="21"/>
-        </w:rPr>
-        <w:t>src/llm_client.py</w:t>
-      </w:r>
-      <w:r>
-        <w:rPr>
-          <w:rFonts w:ascii="Times New Roman" w:hAnsi="Times New Roman" w:eastAsia="Times New Roman"/>
-          <w:sz w:val="24"/>
-        </w:rPr>
-        <w:t xml:space="preserve">; </w:t>
-      </w:r>
-      <w:r>
-        <w:rPr>
-          <w:rFonts w:ascii="Consolas" w:hAnsi="Consolas" w:eastAsia="Consolas"/>
-          <w:sz w:val="21"/>
-        </w:rPr>
-        <w:t>evaluation/manual_review_20.xlsx</w:t>
-      </w:r>
-      <w:r>
-        <w:rPr>
-          <w:rFonts w:ascii="Times New Roman" w:hAnsi="Times New Roman" w:eastAsia="Times New Roman"/>
-          <w:sz w:val="24"/>
-        </w:rPr>
-        <w:t xml:space="preserve">; </w:t>
-      </w:r>
-      <w:r>
-        <w:rPr>
-          <w:rFonts w:ascii="Consolas" w:hAnsi="Consolas" w:eastAsia="Consolas"/>
-          <w:sz w:val="21"/>
-        </w:rPr>
-        <w:t>results/manual_review_summary.csv</w:t>
-      </w:r>
-      <w:r>
-        <w:rPr>
-          <w:rFonts w:ascii="Times New Roman" w:hAnsi="Times New Roman" w:eastAsia="Times New Roman"/>
-          <w:sz w:val="24"/>
-        </w:rPr>
-        <w:t>).</w:t>
+        <w:t>The provisional threshold of 0.30 permits one model request at or above the score and abstains below it (src/risk_pipeline.py). It has not been calibrated. Pydantic checks response structure; current guards suppress non-verbatim highlighted text and citations whose title-and-URL pair is absent from retrieval. These checks reduce particular output errors, not unsupported reasoning. They were added after the saved evaluation and cannot be credited with improving its metrics. An independent LLM judge was not implemented; the recorded reviews are human assessments.</w:t>
       </w:r>
     </w:p>
     <w:p>
@@ -245,9 +139,11 @@
       <w:r>
         <w:rPr>
           <w:rFonts w:ascii="Times New Roman" w:hAnsi="Times New Roman" w:eastAsia="Times New Roman"/>
-          <w:sz w:val="24"/>
+          <w:b/>
+          <w:color w:val="000000"/>
+          <w:sz w:val="28"/>
         </w:rPr>
-        <w:t>Evaluation results and trade-offs</w:t>
+        <w:t>Evaluation results and their implications</w:t>
       </w:r>
     </w:p>
     <w:p>
@@ -255,107 +151,10 @@
       <w:r>
         <w:rPr>
           <w:rFonts w:ascii="Times New Roman" w:hAnsi="Times New Roman" w:eastAsia="Times New Roman"/>
+          <w:color w:val="000000"/>
           <w:sz w:val="24"/>
         </w:rPr>
-        <w:t xml:space="preserve">The locked set contains 30 unique items: 12 </w:t>
-      </w:r>
-      <w:r>
-        <w:rPr>
-          <w:rFonts w:ascii="Consolas" w:hAnsi="Consolas" w:eastAsia="Consolas"/>
-          <w:sz w:val="21"/>
-        </w:rPr>
-        <w:t>high_risk</w:t>
-      </w:r>
-      <w:r>
-        <w:rPr>
-          <w:rFonts w:ascii="Times New Roman" w:hAnsi="Times New Roman" w:eastAsia="Times New Roman"/>
-          <w:sz w:val="24"/>
-        </w:rPr>
-        <w:t xml:space="preserve">, 13 </w:t>
-      </w:r>
-      <w:r>
-        <w:rPr>
-          <w:rFonts w:ascii="Consolas" w:hAnsi="Consolas" w:eastAsia="Consolas"/>
-          <w:sz w:val="21"/>
-        </w:rPr>
-        <w:t>evidence_needed</w:t>
-      </w:r>
-      <w:r>
-        <w:rPr>
-          <w:rFonts w:ascii="Times New Roman" w:hAnsi="Times New Roman" w:eastAsia="Times New Roman"/>
-          <w:sz w:val="24"/>
-        </w:rPr>
-        <w:t xml:space="preserve"> and 5 </w:t>
-      </w:r>
-      <w:r>
-        <w:rPr>
-          <w:rFonts w:ascii="Consolas" w:hAnsi="Consolas" w:eastAsia="Consolas"/>
-          <w:sz w:val="21"/>
-        </w:rPr>
-        <w:t>low_risk</w:t>
-      </w:r>
-      <w:r>
-        <w:rPr>
-          <w:rFonts w:ascii="Times New Roman" w:hAnsi="Times New Roman" w:eastAsia="Times New Roman"/>
-          <w:sz w:val="24"/>
-        </w:rPr>
-        <w:t>. The rule baseline and ClaimTrace results use the same IDs and reference labels. These are project labels, not official regulator labels (</w:t>
-      </w:r>
-      <w:r>
-        <w:rPr>
-          <w:rFonts w:ascii="Consolas" w:hAnsi="Consolas" w:eastAsia="Consolas"/>
-          <w:sz w:val="21"/>
-        </w:rPr>
-        <w:t>evaluation/test_set_locked.csv</w:t>
-      </w:r>
-      <w:r>
-        <w:rPr>
-          <w:rFonts w:ascii="Times New Roman" w:hAnsi="Times New Roman" w:eastAsia="Times New Roman"/>
-          <w:sz w:val="24"/>
-        </w:rPr>
-        <w:t xml:space="preserve">; </w:t>
-      </w:r>
-      <w:r>
-        <w:rPr>
-          <w:rFonts w:ascii="Consolas" w:hAnsi="Consolas" w:eastAsia="Consolas"/>
-          <w:sz w:val="21"/>
-        </w:rPr>
-        <w:t>results/test_baseline.csv</w:t>
-      </w:r>
-      <w:r>
-        <w:rPr>
-          <w:rFonts w:ascii="Times New Roman" w:hAnsi="Times New Roman" w:eastAsia="Times New Roman"/>
-          <w:sz w:val="24"/>
-        </w:rPr>
-        <w:t xml:space="preserve">; </w:t>
-      </w:r>
-      <w:r>
-        <w:rPr>
-          <w:rFonts w:ascii="Consolas" w:hAnsi="Consolas" w:eastAsia="Consolas"/>
-          <w:sz w:val="21"/>
-        </w:rPr>
-        <w:t>results/test_full.csv</w:t>
-      </w:r>
-      <w:r>
-        <w:rPr>
-          <w:rFonts w:ascii="Times New Roman" w:hAnsi="Times New Roman" w:eastAsia="Times New Roman"/>
-          <w:sz w:val="24"/>
-        </w:rPr>
-        <w:t xml:space="preserve">; </w:t>
-      </w:r>
-      <w:r>
-        <w:rPr>
-          <w:rFonts w:ascii="Consolas" w:hAnsi="Consolas" w:eastAsia="Consolas"/>
-          <w:sz w:val="21"/>
-        </w:rPr>
-        <w:t>results/test_metrics.csv</w:t>
-      </w:r>
-      <w:r>
-        <w:rPr>
-          <w:rFonts w:ascii="Times New Roman" w:hAnsi="Times New Roman" w:eastAsia="Times New Roman"/>
-          <w:sz w:val="24"/>
-        </w:rPr>
-        <w:t>).</w:t>
+        <w:t>Both systems were evaluated on the same 30 locked items: 12 high_risk, 13 evidence_needed and five low_risk. Reference labels were frozen before testing and are project judgements, not regulator labels. The saved predictions and denominators are in evaluation/test_set_locked.csv, results/test_baseline.csv and results/test_full.csv.</w:t>
       </w:r>
     </w:p>
     <w:tbl>
@@ -387,7 +186,7 @@
         </w:trPr>
         <w:tc>
           <w:tcPr>
-            <w:tcW w:type="dxa" w:w="3240"/>
+            <w:tcW w:type="dxa" w:w="2880"/>
             <w:vAlign w:val="center"/>
             <w:tcMar>
               <w:top w:w="110" w:type="dxa"/>
@@ -395,7 +194,7 @@
               <w:bottom w:w="110" w:type="dxa"/>
               <w:end w:w="120" w:type="dxa"/>
             </w:tcMar>
-            <w:shd w:fill="123E43"/>
+            <w:shd w:fill="263C50"/>
           </w:tcPr>
           <w:p>
             <w:pPr>
@@ -408,13 +207,13 @@
                 <w:color w:val="FFFFFF"/>
                 <w:sz w:val="21"/>
               </w:rPr>
-              <w:t>Positive-class definition</w:t>
+              <w:t>Positive class</w:t>
             </w:r>
           </w:p>
         </w:tc>
         <w:tc>
           <w:tcPr>
-            <w:tcW w:type="dxa" w:w="1512"/>
+            <w:tcW w:type="dxa" w:w="1728"/>
             <w:vAlign w:val="center"/>
             <w:tcMar>
               <w:top w:w="110" w:type="dxa"/>
@@ -422,7 +221,7 @@
               <w:bottom w:w="110" w:type="dxa"/>
               <w:end w:w="120" w:type="dxa"/>
             </w:tcMar>
-            <w:shd w:fill="123E43"/>
+            <w:shd w:fill="263C50"/>
           </w:tcPr>
           <w:p>
             <w:pPr>
@@ -441,7 +240,7 @@
         </w:tc>
         <w:tc>
           <w:tcPr>
-            <w:tcW w:type="dxa" w:w="2088"/>
+            <w:tcW w:type="dxa" w:w="2160"/>
             <w:vAlign w:val="center"/>
             <w:tcMar>
               <w:top w:w="110" w:type="dxa"/>
@@ -449,7 +248,7 @@
               <w:bottom w:w="110" w:type="dxa"/>
               <w:end w:w="120" w:type="dxa"/>
             </w:tcMar>
-            <w:shd w:fill="123E43"/>
+            <w:shd w:fill="263C50"/>
           </w:tcPr>
           <w:p>
             <w:pPr>
@@ -469,7 +268,7 @@
         </w:tc>
         <w:tc>
           <w:tcPr>
-            <w:tcW w:type="dxa" w:w="2160"/>
+            <w:tcW w:type="dxa" w:w="2232"/>
             <w:vAlign w:val="center"/>
             <w:tcMar>
               <w:top w:w="110" w:type="dxa"/>
@@ -477,7 +276,7 @@
               <w:bottom w:w="110" w:type="dxa"/>
               <w:end w:w="120" w:type="dxa"/>
             </w:tcMar>
-            <w:shd w:fill="123E43"/>
+            <w:shd w:fill="263C50"/>
           </w:tcPr>
           <w:p>
             <w:pPr>
@@ -502,38 +301,7 @@
         </w:trPr>
         <w:tc>
           <w:tcPr>
-            <w:tcW w:type="dxa" w:w="3240"/>
-            <w:vAlign w:val="center"/>
-            <w:tcMar>
-              <w:top w:w="110" w:type="dxa"/>
-              <w:start w:w="120" w:type="dxa"/>
-              <w:bottom w:w="110" w:type="dxa"/>
-              <w:end w:w="120" w:type="dxa"/>
-            </w:tcMar>
-          </w:tcPr>
-          <w:p>
-            <w:pPr>
-              <w:spacing w:after="0" w:line="276" w:lineRule="auto"/>
-            </w:pPr>
-            <w:r>
-              <w:rPr>
-                <w:rFonts w:ascii="Consolas" w:hAnsi="Consolas" w:eastAsia="Consolas"/>
-                <w:sz w:val="19"/>
-              </w:rPr>
-              <w:t>high_risk</w:t>
-            </w:r>
-            <w:r>
-              <w:rPr>
-                <w:rFonts w:ascii="Times New Roman" w:hAnsi="Times New Roman" w:eastAsia="Times New Roman"/>
-                <w:sz w:val="21"/>
-              </w:rPr>
-              <w:t xml:space="preserve"> only (12 positives)</w:t>
-            </w:r>
-          </w:p>
-        </w:tc>
-        <w:tc>
-          <w:tcPr>
-            <w:tcW w:type="dxa" w:w="1512"/>
+            <w:tcW w:type="dxa" w:w="2880"/>
             <w:vAlign w:val="center"/>
             <w:tcMar>
               <w:top w:w="110" w:type="dxa"/>
@@ -549,15 +317,16 @@
             <w:r>
               <w:rPr>
                 <w:rFonts w:ascii="Times New Roman" w:hAnsi="Times New Roman" w:eastAsia="Times New Roman"/>
+                <w:color w:val="000000"/>
                 <w:sz w:val="21"/>
               </w:rPr>
-              <w:t>Rule baseline</w:t>
+              <w:t>High risk only</w:t>
             </w:r>
           </w:p>
         </w:tc>
         <w:tc>
           <w:tcPr>
-            <w:tcW w:type="dxa" w:w="2088"/>
+            <w:tcW w:type="dxa" w:w="1728"/>
             <w:vAlign w:val="center"/>
             <w:tcMar>
               <w:top w:w="110" w:type="dxa"/>
@@ -569,14 +338,14 @@
           <w:p>
             <w:pPr>
               <w:spacing w:after="0" w:line="276" w:lineRule="auto"/>
-              <w:jc w:val="center"/>
             </w:pPr>
             <w:r>
               <w:rPr>
                 <w:rFonts w:ascii="Times New Roman" w:hAnsi="Times New Roman" w:eastAsia="Times New Roman"/>
+                <w:color w:val="000000"/>
                 <w:sz w:val="21"/>
               </w:rPr>
-              <w:t>3/3 = 100%</w:t>
+              <w:t>Rule baseline</w:t>
             </w:r>
           </w:p>
         </w:tc>
@@ -599,203 +368,16 @@
             <w:r>
               <w:rPr>
                 <w:rFonts w:ascii="Times New Roman" w:hAnsi="Times New Roman" w:eastAsia="Times New Roman"/>
+                <w:color w:val="000000"/>
                 <w:sz w:val="21"/>
               </w:rPr>
-              <w:t>3/12 = 25%</w:t>
-            </w:r>
-          </w:p>
-        </w:tc>
-      </w:tr>
-      <w:tr>
-        <w:trPr>
-          <w:cantSplit/>
-        </w:trPr>
-        <w:tc>
-          <w:tcPr>
-            <w:tcW w:type="dxa" w:w="3240"/>
-            <w:vAlign w:val="center"/>
-            <w:tcMar>
-              <w:top w:w="110" w:type="dxa"/>
-              <w:start w:w="120" w:type="dxa"/>
-              <w:bottom w:w="110" w:type="dxa"/>
-              <w:end w:w="120" w:type="dxa"/>
-            </w:tcMar>
-            <w:shd w:fill="EEF5F4"/>
-          </w:tcPr>
-          <w:p>
-            <w:pPr>
-              <w:spacing w:after="0" w:line="276" w:lineRule="auto"/>
-            </w:pPr>
-            <w:r>
-              <w:rPr>
-                <w:rFonts w:ascii="Consolas" w:hAnsi="Consolas" w:eastAsia="Consolas"/>
-                <w:sz w:val="19"/>
-              </w:rPr>
-              <w:t>high_risk</w:t>
-            </w:r>
-            <w:r>
-              <w:rPr>
-                <w:rFonts w:ascii="Times New Roman" w:hAnsi="Times New Roman" w:eastAsia="Times New Roman"/>
-                <w:sz w:val="21"/>
-              </w:rPr>
-              <w:t xml:space="preserve"> only (12 positives)</w:t>
+              <w:t>3/3 = 100%</w:t>
             </w:r>
           </w:p>
         </w:tc>
         <w:tc>
           <w:tcPr>
-            <w:tcW w:type="dxa" w:w="1512"/>
-            <w:vAlign w:val="center"/>
-            <w:tcMar>
-              <w:top w:w="110" w:type="dxa"/>
-              <w:start w:w="120" w:type="dxa"/>
-              <w:bottom w:w="110" w:type="dxa"/>
-              <w:end w:w="120" w:type="dxa"/>
-            </w:tcMar>
-            <w:shd w:fill="EEF5F4"/>
-          </w:tcPr>
-          <w:p>
-            <w:pPr>
-              <w:spacing w:after="0" w:line="276" w:lineRule="auto"/>
-            </w:pPr>
-            <w:r>
-              <w:rPr>
-                <w:rFonts w:ascii="Times New Roman" w:hAnsi="Times New Roman" w:eastAsia="Times New Roman"/>
-                <w:sz w:val="21"/>
-              </w:rPr>
-              <w:t>ClaimTrace</w:t>
-            </w:r>
-          </w:p>
-        </w:tc>
-        <w:tc>
-          <w:tcPr>
-            <w:tcW w:type="dxa" w:w="2088"/>
-            <w:vAlign w:val="center"/>
-            <w:tcMar>
-              <w:top w:w="110" w:type="dxa"/>
-              <w:start w:w="120" w:type="dxa"/>
-              <w:bottom w:w="110" w:type="dxa"/>
-              <w:end w:w="120" w:type="dxa"/>
-            </w:tcMar>
-            <w:shd w:fill="EEF5F4"/>
-          </w:tcPr>
-          <w:p>
-            <w:pPr>
-              <w:spacing w:after="0" w:line="276" w:lineRule="auto"/>
-              <w:jc w:val="center"/>
-            </w:pPr>
-            <w:r>
-              <w:rPr>
-                <w:rFonts w:ascii="Times New Roman" w:hAnsi="Times New Roman" w:eastAsia="Times New Roman"/>
-                <w:sz w:val="21"/>
-              </w:rPr>
-              <w:t>10/17 = 58.8%</w:t>
-            </w:r>
-          </w:p>
-        </w:tc>
-        <w:tc>
-          <w:tcPr>
-            <w:tcW w:type="dxa" w:w="2160"/>
-            <w:vAlign w:val="center"/>
-            <w:tcMar>
-              <w:top w:w="110" w:type="dxa"/>
-              <w:start w:w="120" w:type="dxa"/>
-              <w:bottom w:w="110" w:type="dxa"/>
-              <w:end w:w="120" w:type="dxa"/>
-            </w:tcMar>
-            <w:shd w:fill="EEF5F4"/>
-          </w:tcPr>
-          <w:p>
-            <w:pPr>
-              <w:spacing w:after="0" w:line="276" w:lineRule="auto"/>
-              <w:jc w:val="center"/>
-            </w:pPr>
-            <w:r>
-              <w:rPr>
-                <w:rFonts w:ascii="Times New Roman" w:hAnsi="Times New Roman" w:eastAsia="Times New Roman"/>
-                <w:sz w:val="21"/>
-              </w:rPr>
-              <w:t>10/12 = 83.3%</w:t>
-            </w:r>
-          </w:p>
-        </w:tc>
-      </w:tr>
-      <w:tr>
-        <w:trPr>
-          <w:cantSplit/>
-        </w:trPr>
-        <w:tc>
-          <w:tcPr>
-            <w:tcW w:type="dxa" w:w="3240"/>
-            <w:vAlign w:val="center"/>
-            <w:tcMar>
-              <w:top w:w="110" w:type="dxa"/>
-              <w:start w:w="120" w:type="dxa"/>
-              <w:bottom w:w="110" w:type="dxa"/>
-              <w:end w:w="120" w:type="dxa"/>
-            </w:tcMar>
-          </w:tcPr>
-          <w:p>
-            <w:pPr>
-              <w:spacing w:after="0" w:line="276" w:lineRule="auto"/>
-            </w:pPr>
-            <w:r>
-              <w:rPr>
-                <w:rFonts w:ascii="Consolas" w:hAnsi="Consolas" w:eastAsia="Consolas"/>
-                <w:sz w:val="19"/>
-              </w:rPr>
-              <w:t>high_risk</w:t>
-            </w:r>
-            <w:r>
-              <w:rPr>
-                <w:rFonts w:ascii="Times New Roman" w:hAnsi="Times New Roman" w:eastAsia="Times New Roman"/>
-                <w:sz w:val="21"/>
-              </w:rPr>
-              <w:t xml:space="preserve"> + </w:t>
-            </w:r>
-            <w:r>
-              <w:rPr>
-                <w:rFonts w:ascii="Consolas" w:hAnsi="Consolas" w:eastAsia="Consolas"/>
-                <w:sz w:val="19"/>
-              </w:rPr>
-              <w:t>evidence_needed</w:t>
-            </w:r>
-            <w:r>
-              <w:rPr>
-                <w:rFonts w:ascii="Times New Roman" w:hAnsi="Times New Roman" w:eastAsia="Times New Roman"/>
-                <w:sz w:val="21"/>
-              </w:rPr>
-              <w:t xml:space="preserve"> (25 positives)</w:t>
-            </w:r>
-          </w:p>
-        </w:tc>
-        <w:tc>
-          <w:tcPr>
-            <w:tcW w:type="dxa" w:w="1512"/>
-            <w:vAlign w:val="center"/>
-            <w:tcMar>
-              <w:top w:w="110" w:type="dxa"/>
-              <w:start w:w="120" w:type="dxa"/>
-              <w:bottom w:w="110" w:type="dxa"/>
-              <w:end w:w="120" w:type="dxa"/>
-            </w:tcMar>
-          </w:tcPr>
-          <w:p>
-            <w:pPr>
-              <w:spacing w:after="0" w:line="276" w:lineRule="auto"/>
-            </w:pPr>
-            <w:r>
-              <w:rPr>
-                <w:rFonts w:ascii="Times New Roman" w:hAnsi="Times New Roman" w:eastAsia="Times New Roman"/>
-                <w:sz w:val="21"/>
-              </w:rPr>
-              <w:t>Rule baseline</w:t>
-            </w:r>
-          </w:p>
-        </w:tc>
-        <w:tc>
-          <w:tcPr>
-            <w:tcW w:type="dxa" w:w="2088"/>
+            <w:tcW w:type="dxa" w:w="2232"/>
             <w:vAlign w:val="center"/>
             <w:tcMar>
               <w:top w:w="110" w:type="dxa"/>
@@ -812,9 +394,176 @@
             <w:r>
               <w:rPr>
                 <w:rFonts w:ascii="Times New Roman" w:hAnsi="Times New Roman" w:eastAsia="Times New Roman"/>
+                <w:color w:val="000000"/>
                 <w:sz w:val="21"/>
               </w:rPr>
-              <w:t>8/8 = 100%</w:t>
+              <w:t>3/12 = 25%</w:t>
+            </w:r>
+          </w:p>
+        </w:tc>
+      </w:tr>
+      <w:tr>
+        <w:trPr>
+          <w:cantSplit/>
+        </w:trPr>
+        <w:tc>
+          <w:tcPr>
+            <w:tcW w:type="dxa" w:w="2880"/>
+            <w:vAlign w:val="center"/>
+            <w:tcMar>
+              <w:top w:w="110" w:type="dxa"/>
+              <w:start w:w="120" w:type="dxa"/>
+              <w:bottom w:w="110" w:type="dxa"/>
+              <w:end w:w="120" w:type="dxa"/>
+            </w:tcMar>
+            <w:shd w:fill="F2F4F6"/>
+          </w:tcPr>
+          <w:p>
+            <w:pPr>
+              <w:spacing w:after="0" w:line="276" w:lineRule="auto"/>
+            </w:pPr>
+            <w:r>
+              <w:rPr>
+                <w:rFonts w:ascii="Times New Roman" w:hAnsi="Times New Roman" w:eastAsia="Times New Roman"/>
+                <w:color w:val="000000"/>
+                <w:sz w:val="21"/>
+              </w:rPr>
+              <w:t>High risk only</w:t>
+            </w:r>
+          </w:p>
+        </w:tc>
+        <w:tc>
+          <w:tcPr>
+            <w:tcW w:type="dxa" w:w="1728"/>
+            <w:vAlign w:val="center"/>
+            <w:tcMar>
+              <w:top w:w="110" w:type="dxa"/>
+              <w:start w:w="120" w:type="dxa"/>
+              <w:bottom w:w="110" w:type="dxa"/>
+              <w:end w:w="120" w:type="dxa"/>
+            </w:tcMar>
+            <w:shd w:fill="F2F4F6"/>
+          </w:tcPr>
+          <w:p>
+            <w:pPr>
+              <w:spacing w:after="0" w:line="276" w:lineRule="auto"/>
+            </w:pPr>
+            <w:r>
+              <w:rPr>
+                <w:rFonts w:ascii="Times New Roman" w:hAnsi="Times New Roman" w:eastAsia="Times New Roman"/>
+                <w:color w:val="000000"/>
+                <w:sz w:val="21"/>
+              </w:rPr>
+              <w:t>ClaimTrace</w:t>
+            </w:r>
+          </w:p>
+        </w:tc>
+        <w:tc>
+          <w:tcPr>
+            <w:tcW w:type="dxa" w:w="2160"/>
+            <w:vAlign w:val="center"/>
+            <w:tcMar>
+              <w:top w:w="110" w:type="dxa"/>
+              <w:start w:w="120" w:type="dxa"/>
+              <w:bottom w:w="110" w:type="dxa"/>
+              <w:end w:w="120" w:type="dxa"/>
+            </w:tcMar>
+            <w:shd w:fill="F2F4F6"/>
+          </w:tcPr>
+          <w:p>
+            <w:pPr>
+              <w:spacing w:after="0" w:line="276" w:lineRule="auto"/>
+              <w:jc w:val="center"/>
+            </w:pPr>
+            <w:r>
+              <w:rPr>
+                <w:rFonts w:ascii="Times New Roman" w:hAnsi="Times New Roman" w:eastAsia="Times New Roman"/>
+                <w:color w:val="000000"/>
+                <w:sz w:val="21"/>
+              </w:rPr>
+              <w:t>10/17 = 58.8%</w:t>
+            </w:r>
+          </w:p>
+        </w:tc>
+        <w:tc>
+          <w:tcPr>
+            <w:tcW w:type="dxa" w:w="2232"/>
+            <w:vAlign w:val="center"/>
+            <w:tcMar>
+              <w:top w:w="110" w:type="dxa"/>
+              <w:start w:w="120" w:type="dxa"/>
+              <w:bottom w:w="110" w:type="dxa"/>
+              <w:end w:w="120" w:type="dxa"/>
+            </w:tcMar>
+            <w:shd w:fill="F2F4F6"/>
+          </w:tcPr>
+          <w:p>
+            <w:pPr>
+              <w:spacing w:after="0" w:line="276" w:lineRule="auto"/>
+              <w:jc w:val="center"/>
+            </w:pPr>
+            <w:r>
+              <w:rPr>
+                <w:rFonts w:ascii="Times New Roman" w:hAnsi="Times New Roman" w:eastAsia="Times New Roman"/>
+                <w:color w:val="000000"/>
+                <w:sz w:val="21"/>
+              </w:rPr>
+              <w:t>10/12 = 83.3%</w:t>
+            </w:r>
+          </w:p>
+        </w:tc>
+      </w:tr>
+      <w:tr>
+        <w:trPr>
+          <w:cantSplit/>
+        </w:trPr>
+        <w:tc>
+          <w:tcPr>
+            <w:tcW w:type="dxa" w:w="2880"/>
+            <w:vAlign w:val="center"/>
+            <w:tcMar>
+              <w:top w:w="110" w:type="dxa"/>
+              <w:start w:w="120" w:type="dxa"/>
+              <w:bottom w:w="110" w:type="dxa"/>
+              <w:end w:w="120" w:type="dxa"/>
+            </w:tcMar>
+          </w:tcPr>
+          <w:p>
+            <w:pPr>
+              <w:spacing w:after="0" w:line="276" w:lineRule="auto"/>
+            </w:pPr>
+            <w:r>
+              <w:rPr>
+                <w:rFonts w:ascii="Times New Roman" w:hAnsi="Times New Roman" w:eastAsia="Times New Roman"/>
+                <w:color w:val="000000"/>
+                <w:sz w:val="21"/>
+              </w:rPr>
+              <w:t>High risk plus evidence needed</w:t>
+            </w:r>
+          </w:p>
+        </w:tc>
+        <w:tc>
+          <w:tcPr>
+            <w:tcW w:type="dxa" w:w="1728"/>
+            <w:vAlign w:val="center"/>
+            <w:tcMar>
+              <w:top w:w="110" w:type="dxa"/>
+              <w:start w:w="120" w:type="dxa"/>
+              <w:bottom w:w="110" w:type="dxa"/>
+              <w:end w:w="120" w:type="dxa"/>
+            </w:tcMar>
+          </w:tcPr>
+          <w:p>
+            <w:pPr>
+              <w:spacing w:after="0" w:line="276" w:lineRule="auto"/>
+            </w:pPr>
+            <w:r>
+              <w:rPr>
+                <w:rFonts w:ascii="Times New Roman" w:hAnsi="Times New Roman" w:eastAsia="Times New Roman"/>
+                <w:color w:val="000000"/>
+                <w:sz w:val="21"/>
+              </w:rPr>
+              <w:t>Rule baseline</w:t>
             </w:r>
           </w:p>
         </w:tc>
@@ -837,6 +586,33 @@
             <w:r>
               <w:rPr>
                 <w:rFonts w:ascii="Times New Roman" w:hAnsi="Times New Roman" w:eastAsia="Times New Roman"/>
+                <w:color w:val="000000"/>
+                <w:sz w:val="21"/>
+              </w:rPr>
+              <w:t>8/8 = 100%</w:t>
+            </w:r>
+          </w:p>
+        </w:tc>
+        <w:tc>
+          <w:tcPr>
+            <w:tcW w:type="dxa" w:w="2232"/>
+            <w:vAlign w:val="center"/>
+            <w:tcMar>
+              <w:top w:w="110" w:type="dxa"/>
+              <w:start w:w="120" w:type="dxa"/>
+              <w:bottom w:w="110" w:type="dxa"/>
+              <w:end w:w="120" w:type="dxa"/>
+            </w:tcMar>
+          </w:tcPr>
+          <w:p>
+            <w:pPr>
+              <w:spacing w:after="0" w:line="276" w:lineRule="auto"/>
+              <w:jc w:val="center"/>
+            </w:pPr>
+            <w:r>
+              <w:rPr>
+                <w:rFonts w:ascii="Times New Roman" w:hAnsi="Times New Roman" w:eastAsia="Times New Roman"/>
+                <w:color w:val="000000"/>
                 <w:sz w:val="21"/>
               </w:rPr>
               <w:t>8/25 = 32%</w:t>
@@ -850,7 +626,7 @@
         </w:trPr>
         <w:tc>
           <w:tcPr>
-            <w:tcW w:type="dxa" w:w="3240"/>
+            <w:tcW w:type="dxa" w:w="2880"/>
             <w:vAlign w:val="center"/>
             <w:tcMar>
               <w:top w:w="110" w:type="dxa"/>
@@ -858,53 +634,7 @@
               <w:bottom w:w="110" w:type="dxa"/>
               <w:end w:w="120" w:type="dxa"/>
             </w:tcMar>
-            <w:shd w:fill="EEF5F4"/>
-          </w:tcPr>
-          <w:p>
-            <w:pPr>
-              <w:spacing w:after="0" w:line="276" w:lineRule="auto"/>
-            </w:pPr>
-            <w:r>
-              <w:rPr>
-                <w:rFonts w:ascii="Consolas" w:hAnsi="Consolas" w:eastAsia="Consolas"/>
-                <w:sz w:val="19"/>
-              </w:rPr>
-              <w:t>high_risk</w:t>
-            </w:r>
-            <w:r>
-              <w:rPr>
-                <w:rFonts w:ascii="Times New Roman" w:hAnsi="Times New Roman" w:eastAsia="Times New Roman"/>
-                <w:sz w:val="21"/>
-              </w:rPr>
-              <w:t xml:space="preserve"> + </w:t>
-            </w:r>
-            <w:r>
-              <w:rPr>
-                <w:rFonts w:ascii="Consolas" w:hAnsi="Consolas" w:eastAsia="Consolas"/>
-                <w:sz w:val="19"/>
-              </w:rPr>
-              <w:t>evidence_needed</w:t>
-            </w:r>
-            <w:r>
-              <w:rPr>
-                <w:rFonts w:ascii="Times New Roman" w:hAnsi="Times New Roman" w:eastAsia="Times New Roman"/>
-                <w:sz w:val="21"/>
-              </w:rPr>
-              <w:t xml:space="preserve"> (25 positives)</w:t>
-            </w:r>
-          </w:p>
-        </w:tc>
-        <w:tc>
-          <w:tcPr>
-            <w:tcW w:type="dxa" w:w="1512"/>
-            <w:vAlign w:val="center"/>
-            <w:tcMar>
-              <w:top w:w="110" w:type="dxa"/>
-              <w:start w:w="120" w:type="dxa"/>
-              <w:bottom w:w="110" w:type="dxa"/>
-              <w:end w:w="120" w:type="dxa"/>
-            </w:tcMar>
-            <w:shd w:fill="EEF5F4"/>
+            <w:shd w:fill="F2F4F6"/>
           </w:tcPr>
           <w:p>
             <w:pPr>
@@ -913,15 +643,16 @@
             <w:r>
               <w:rPr>
                 <w:rFonts w:ascii="Times New Roman" w:hAnsi="Times New Roman" w:eastAsia="Times New Roman"/>
+                <w:color w:val="000000"/>
                 <w:sz w:val="21"/>
               </w:rPr>
-              <w:t>ClaimTrace</w:t>
+              <w:t>High risk plus evidence needed</w:t>
             </w:r>
           </w:p>
         </w:tc>
         <w:tc>
           <w:tcPr>
-            <w:tcW w:type="dxa" w:w="2088"/>
+            <w:tcW w:type="dxa" w:w="1728"/>
             <w:vAlign w:val="center"/>
             <w:tcMar>
               <w:top w:w="110" w:type="dxa"/>
@@ -929,19 +660,19 @@
               <w:bottom w:w="110" w:type="dxa"/>
               <w:end w:w="120" w:type="dxa"/>
             </w:tcMar>
-            <w:shd w:fill="EEF5F4"/>
+            <w:shd w:fill="F2F4F6"/>
           </w:tcPr>
           <w:p>
             <w:pPr>
               <w:spacing w:after="0" w:line="276" w:lineRule="auto"/>
-              <w:jc w:val="center"/>
             </w:pPr>
             <w:r>
               <w:rPr>
                 <w:rFonts w:ascii="Times New Roman" w:hAnsi="Times New Roman" w:eastAsia="Times New Roman"/>
+                <w:color w:val="000000"/>
                 <w:sz w:val="21"/>
               </w:rPr>
-              <w:t>17/17 = 100%</w:t>
+              <w:t>ClaimTrace</w:t>
             </w:r>
           </w:p>
         </w:tc>
@@ -955,7 +686,7 @@
               <w:bottom w:w="110" w:type="dxa"/>
               <w:end w:w="120" w:type="dxa"/>
             </w:tcMar>
-            <w:shd w:fill="EEF5F4"/>
+            <w:shd w:fill="F2F4F6"/>
           </w:tcPr>
           <w:p>
             <w:pPr>
@@ -965,6 +696,34 @@
             <w:r>
               <w:rPr>
                 <w:rFonts w:ascii="Times New Roman" w:hAnsi="Times New Roman" w:eastAsia="Times New Roman"/>
+                <w:color w:val="000000"/>
+                <w:sz w:val="21"/>
+              </w:rPr>
+              <w:t>17/17 = 100%</w:t>
+            </w:r>
+          </w:p>
+        </w:tc>
+        <w:tc>
+          <w:tcPr>
+            <w:tcW w:type="dxa" w:w="2232"/>
+            <w:vAlign w:val="center"/>
+            <w:tcMar>
+              <w:top w:w="110" w:type="dxa"/>
+              <w:start w:w="120" w:type="dxa"/>
+              <w:bottom w:w="110" w:type="dxa"/>
+              <w:end w:w="120" w:type="dxa"/>
+            </w:tcMar>
+            <w:shd w:fill="F2F4F6"/>
+          </w:tcPr>
+          <w:p>
+            <w:pPr>
+              <w:spacing w:after="0" w:line="276" w:lineRule="auto"/>
+              <w:jc w:val="center"/>
+            </w:pPr>
+            <w:r>
+              <w:rPr>
+                <w:rFonts w:ascii="Times New Roman" w:hAnsi="Times New Roman" w:eastAsia="Times New Roman"/>
+                <w:color w:val="000000"/>
                 <w:sz w:val="21"/>
               </w:rPr>
               <w:t>17/25 = 68%</w:t>
@@ -983,23 +742,10 @@
       <w:r>
         <w:rPr>
           <w:rFonts w:ascii="Times New Roman" w:hAnsi="Times New Roman" w:eastAsia="Times New Roman"/>
+          <w:color w:val="000000"/>
           <w:sz w:val="24"/>
         </w:rPr>
-        <w:t xml:space="preserve">Precision is TP/(TP+FP); recall is TP/(TP+FN). The proposal set an 80% recall target for the combined risk/evidence-needed class. ClaimTrace's 68% does not meet it; the 83.3% high-risk-only result uses a different positive class and cannot substitute for the target. </w:t>
-      </w:r>
-      <w:r>
-        <w:rPr>
-          <w:rFonts w:ascii="Consolas" w:hAnsi="Consolas" w:eastAsia="Consolas"/>
-          <w:sz w:val="21"/>
-        </w:rPr>
-        <w:t>insufficient_evidence</w:t>
-      </w:r>
-      <w:r>
-        <w:rPr>
-          <w:rFonts w:ascii="Times New Roman" w:hAnsi="Times New Roman" w:eastAsia="Times New Roman"/>
-          <w:sz w:val="24"/>
-        </w:rPr>
-        <w:t xml:space="preserve"> is an abstention, not an automatic detection, so a positive item referred for review counts as a missed detection in combined recall.</w:t>
+        <w:t>Precision is TP/(TP+FP), and recall is TP/(TP+FN). The proposal's 80% target concerns the combined class. The 83.3% high-risk recall cannot replace the unmet 68% combined result. Abstention is not automatic detection: a positive item returned as insufficient_evidence remains a false negative. ClaimTrace detects more high-risk items than the baseline, but its seven high-risk false positives would require reviewers to distinguish a warning from evidence of wrongdoing.</w:t>
       </w:r>
     </w:p>
     <w:p>
@@ -1007,93 +753,10 @@
       <w:r>
         <w:rPr>
           <w:rFonts w:ascii="Times New Roman" w:hAnsi="Times New Roman" w:eastAsia="Times New Roman"/>
+          <w:color w:val="000000"/>
           <w:sz w:val="24"/>
         </w:rPr>
-        <w:t xml:space="preserve">Three-class Macro F1, the unweighted mean across </w:t>
-      </w:r>
-      <w:r>
-        <w:rPr>
-          <w:rFonts w:ascii="Consolas" w:hAnsi="Consolas" w:eastAsia="Consolas"/>
-          <w:sz w:val="21"/>
-        </w:rPr>
-        <w:t>high_risk</w:t>
-      </w:r>
-      <w:r>
-        <w:rPr>
-          <w:rFonts w:ascii="Times New Roman" w:hAnsi="Times New Roman" w:eastAsia="Times New Roman"/>
-          <w:sz w:val="24"/>
-        </w:rPr>
-        <w:t xml:space="preserve">, </w:t>
-      </w:r>
-      <w:r>
-        <w:rPr>
-          <w:rFonts w:ascii="Consolas" w:hAnsi="Consolas" w:eastAsia="Consolas"/>
-          <w:sz w:val="21"/>
-        </w:rPr>
-        <w:t>evidence_needed</w:t>
-      </w:r>
-      <w:r>
-        <w:rPr>
-          <w:rFonts w:ascii="Times New Roman" w:hAnsi="Times New Roman" w:eastAsia="Times New Roman"/>
-          <w:sz w:val="24"/>
-        </w:rPr>
-        <w:t xml:space="preserve"> and </w:t>
-      </w:r>
-      <w:r>
-        <w:rPr>
-          <w:rFonts w:ascii="Consolas" w:hAnsi="Consolas" w:eastAsia="Consolas"/>
-          <w:sz w:val="21"/>
-        </w:rPr>
-        <w:t>low_risk</w:t>
-      </w:r>
-      <w:r>
-        <w:rPr>
-          <w:rFonts w:ascii="Times New Roman" w:hAnsi="Times New Roman" w:eastAsia="Times New Roman"/>
-          <w:sz w:val="24"/>
-        </w:rPr>
-        <w:t xml:space="preserve">, was 40.5% for the baseline and 48.0% for ClaimTrace. ClaimTrace predicted no </w:t>
-      </w:r>
-      <w:r>
-        <w:rPr>
-          <w:rFonts w:ascii="Consolas" w:hAnsi="Consolas" w:eastAsia="Consolas"/>
-          <w:sz w:val="21"/>
-        </w:rPr>
-        <w:t>evidence_needed</w:t>
-      </w:r>
-      <w:r>
-        <w:rPr>
-          <w:rFonts w:ascii="Times New Roman" w:hAnsi="Times New Roman" w:eastAsia="Times New Roman"/>
-          <w:sz w:val="24"/>
-        </w:rPr>
-        <w:t xml:space="preserve"> items. It covered 20/30 items (66.7%) and abstained on 10/30 (33.3%). Agreement with project labels among judged items was 13/20 (65.0%); the baseline agreed on 12/30 (40.0%). These different denominators make agreement rates non-comparable. ClaimTrace's higher recall came with lower coverage and more high-risk false positives (</w:t>
-      </w:r>
-      <w:r>
-        <w:rPr>
-          <w:rFonts w:ascii="Consolas" w:hAnsi="Consolas" w:eastAsia="Consolas"/>
-          <w:sz w:val="21"/>
-        </w:rPr>
-        <w:t>results/test_metrics.csv</w:t>
-      </w:r>
-      <w:r>
-        <w:rPr>
-          <w:rFonts w:ascii="Times New Roman" w:hAnsi="Times New Roman" w:eastAsia="Times New Roman"/>
-          <w:sz w:val="24"/>
-        </w:rPr>
-        <w:t xml:space="preserve">; </w:t>
-      </w:r>
-      <w:r>
-        <w:rPr>
-          <w:rFonts w:ascii="Consolas" w:hAnsi="Consolas" w:eastAsia="Consolas"/>
-          <w:sz w:val="21"/>
-        </w:rPr>
-        <w:t>results/test_summary.csv</w:t>
-      </w:r>
-      <w:r>
-        <w:rPr>
-          <w:rFonts w:ascii="Times New Roman" w:hAnsi="Times New Roman" w:eastAsia="Times New Roman"/>
-          <w:sz w:val="24"/>
-        </w:rPr>
-        <w:t>).</w:t>
+        <w:t>Three-class Macro F1 is 40.5% for the baseline and 48.0% for ClaimTrace, averaging F1 equally across the three reference labels and counting abstentions as misses for their true class (results/test_metrics.csv). ClaimTrace predicted no evidence_needed items despite 13 reference examples. The improvement therefore conceals a class-level failure. One additional miss changes high-risk recall by 8.3 percentage points, illustrating the estimate's sensitivity to this small sample.</w:t>
       </w:r>
     </w:p>
     <w:p>
@@ -1101,51 +764,21 @@
       <w:r>
         <w:rPr>
           <w:rFonts w:ascii="Times New Roman" w:hAnsi="Times New Roman" w:eastAsia="Times New Roman"/>
+          <w:color w:val="000000"/>
           <w:sz w:val="24"/>
         </w:rPr>
-        <w:t xml:space="preserve">Human review covered 20 items (10 per source group). Ten of 11 applicable citations supported the reminder (90.9%); nine records had no applicable citation. This is not overall citation accuracy. Recommendation actionability remains unassessed because saved outputs lack </w:t>
+        <w:t>Coverage is 20/30 (66.7%); abstention is 10/30 (33.3%). Label agreement among assessed items is 13/20 (65%), versus 12/30 (40%) for the baseline, so these percentages are not directly comparable. Case-derived items have 7/14 agreement and 14/15 coverage; synthetic items have 6/6 agreement but only 6/15 coverage. The nine synthetic abstentions prevent interpreting 6/6 as 100% accuracy on new claims (results/test_summary.csv). Case-derived success also does not establish generalisation to unseen cases.</w:t>
       </w:r>
-      <w:r>
-        <w:rPr>
-          <w:rFonts w:ascii="Consolas" w:hAnsi="Consolas" w:eastAsia="Consolas"/>
-          <w:sz w:val="21"/>
-        </w:rPr>
-        <w:t>next_action</w:t>
-      </w:r>
+    </w:p>
+    <w:p>
+      <w:pPr/>
       <w:r>
         <w:rPr>
           <w:rFonts w:ascii="Times New Roman" w:hAnsi="Times New Roman" w:eastAsia="Times New Roman"/>
+          <w:color w:val="000000"/>
           <w:sz w:val="24"/>
         </w:rPr>
-        <w:t>. The locked test shows judged agreement/coverage of 7/14 and 14/15 for case-derived items, and 6/6 with 6/15 for synthetic items (nine abstentions). Neither 6/6 nor these small audits establish generalisation (</w:t>
-      </w:r>
-      <w:r>
-        <w:rPr>
-          <w:rFonts w:ascii="Consolas" w:hAnsi="Consolas" w:eastAsia="Consolas"/>
-          <w:sz w:val="21"/>
-        </w:rPr>
-        <w:t>results/manual_review_summary.csv</w:t>
-      </w:r>
-      <w:r>
-        <w:rPr>
-          <w:rFonts w:ascii="Times New Roman" w:hAnsi="Times New Roman" w:eastAsia="Times New Roman"/>
-          <w:sz w:val="24"/>
-        </w:rPr>
-        <w:t xml:space="preserve">; </w:t>
-      </w:r>
-      <w:r>
-        <w:rPr>
-          <w:rFonts w:ascii="Consolas" w:hAnsi="Consolas" w:eastAsia="Consolas"/>
-          <w:sz w:val="21"/>
-        </w:rPr>
-        <w:t>results/test_summary.csv</w:t>
-      </w:r>
-      <w:r>
-        <w:rPr>
-          <w:rFonts w:ascii="Times New Roman" w:hAnsi="Times New Roman" w:eastAsia="Times New Roman"/>
-          <w:sz w:val="24"/>
-        </w:rPr>
-        <w:t>).</w:t>
+        <w:t>Twenty human reviews cover ten items per source group. Citation support is 10/11 among present, assessable citations; nine records are not applicable. This is not overall citation accuracy. Recommendation actionability could not be assessed because historical outputs omit next_action (results/manual_review_summary.csv). Samples are partly synthetic, and no inter-rater reliability estimate is available. These weaknesses call for more independently labelled examples and a new holdout, not adjustments to the locked labels or test-set tuning.</w:t>
       </w:r>
     </w:p>
     <w:p>
@@ -1155,9 +788,11 @@
       <w:r>
         <w:rPr>
           <w:rFonts w:ascii="Times New Roman" w:hAnsi="Times New Roman" w:eastAsia="Times New Roman"/>
-          <w:sz w:val="24"/>
+          <w:b/>
+          <w:color w:val="000000"/>
+          <w:sz w:val="28"/>
         </w:rPr>
-        <w:t>Critical reflection and future direction</w:t>
+        <w:t>Cost privacy and next steps</w:t>
       </w:r>
     </w:p>
     <w:p>
@@ -1165,103 +800,10 @@
       <w:r>
         <w:rPr>
           <w:rFonts w:ascii="Times New Roman" w:hAnsi="Times New Roman" w:eastAsia="Times New Roman"/>
+          <w:color w:val="000000"/>
           <w:sz w:val="24"/>
         </w:rPr>
-        <w:t>Before ClaimTrace, my own workflow checked product-page copy against a prohibited-words list and then sent it for supervisor review. The prototype puts rule matches, related public cases and a screening card in one view. This changes evidence assembly only: I have no seller interviews, deployment, timed comparison or adoption evidence, so cannot claim faster work or impact.</w:t>
-      </w:r>
-    </w:p>
-    <w:p>
-      <w:pPr/>
-      <w:r>
-        <w:rPr>
-          <w:rFonts w:ascii="Times New Roman" w:hAnsi="Times New Roman" w:eastAsia="Times New Roman"/>
-          <w:sz w:val="24"/>
-        </w:rPr>
-        <w:t xml:space="preserve">Thirty locked items cannot support broad claims: one miss changes high-risk recall by 8.3 percentage points and combined recall by 4 points. The same-set baseline is a reference, not evidence of marketplace performance. Macro F1 is modest at 48.0%, and the system's zero </w:t>
-      </w:r>
-      <w:r>
-        <w:rPr>
-          <w:rFonts w:ascii="Consolas" w:hAnsi="Consolas" w:eastAsia="Consolas"/>
-          <w:sz w:val="21"/>
-        </w:rPr>
-        <w:t>evidence_needed</w:t>
-      </w:r>
-      <w:r>
-        <w:rPr>
-          <w:rFonts w:ascii="Times New Roman" w:hAnsi="Times New Roman" w:eastAsia="Times New Roman"/>
-          <w:sz w:val="24"/>
-        </w:rPr>
-        <w:t xml:space="preserve"> predictions reveal a class-level failure. Twenty human reviews and ten retrieval queries are small case audits; no inter-rater reliability statistic is available. Citation support of 10/11 applies only to applicable citations in the reviewed sample.</w:t>
-      </w:r>
-    </w:p>
-    <w:p>
-      <w:pPr/>
-      <w:r>
-        <w:rPr>
-          <w:rFonts w:ascii="Times New Roman" w:hAnsi="Times New Roman" w:eastAsia="Times New Roman"/>
-          <w:sz w:val="24"/>
-        </w:rPr>
-        <w:t xml:space="preserve">To address the English-model/Chinese-text mismatch raised in feedback, I replaced the proposal's English-trained MiniLM with a multilingual model and audited ten development queries; this was not a controlled model comparison. I did not tune the 0.30 threshold or use the locked set for tuning. New exact-span and source guards pass offline unit tests, but were not part of historical predictions and have no measured effect on reported metrics. Remaining issues include partly synthetic data, unverified source-reuse rights and link availability, and missing historical </w:t>
-      </w:r>
-      <w:r>
-        <w:rPr>
-          <w:rFonts w:ascii="Consolas" w:hAnsi="Consolas" w:eastAsia="Consolas"/>
-          <w:sz w:val="21"/>
-        </w:rPr>
-        <w:t>next_action</w:t>
-      </w:r>
-      <w:r>
-        <w:rPr>
-          <w:rFonts w:ascii="Times New Roman" w:hAnsi="Times New Roman" w:eastAsia="Times New Roman"/>
-          <w:sz w:val="24"/>
-        </w:rPr>
-        <w:t xml:space="preserve"> fields.</w:t>
-      </w:r>
-    </w:p>
-    <w:p>
-      <w:pPr/>
-      <w:r>
-        <w:rPr>
-          <w:rFonts w:ascii="Times New Roman" w:hAnsi="Times New Roman" w:eastAsia="Times New Roman"/>
-          <w:sz w:val="24"/>
-        </w:rPr>
-        <w:t>The next step is to collect more independently labelled Chinese claims, compare retrieval and threshold settings on development data only, and evaluate a frozen version on a new holdout with documented human adjudication. Until then, these results support a prototype, not a production compliance claim; the original 80% combined-recall target remains unmet.</w:t>
-      </w:r>
-    </w:p>
-    <w:p>
-      <w:pPr>
-        <w:pStyle w:val="Heading1"/>
-      </w:pPr>
-      <w:r>
-        <w:rPr>
-          <w:rFonts w:ascii="Times New Roman" w:hAnsi="Times New Roman" w:eastAsia="Times New Roman"/>
-          <w:sz w:val="24"/>
-        </w:rPr>
-        <w:t>Cost, privacy and conclusion</w:t>
-      </w:r>
-    </w:p>
-    <w:p>
-      <w:pPr/>
-      <w:r>
-        <w:rPr>
-          <w:rFonts w:ascii="Times New Roman" w:hAnsi="Times New Roman" w:eastAsia="Times New Roman"/>
-          <w:sz w:val="24"/>
-        </w:rPr>
-        <w:t xml:space="preserve">Two successful development-sample requests were logged for </w:t>
-      </w:r>
-      <w:r>
-        <w:rPr>
-          <w:rFonts w:ascii="Consolas" w:hAnsi="Consolas" w:eastAsia="Consolas"/>
-          <w:sz w:val="21"/>
-        </w:rPr>
-        <w:t>openai/gpt-4o-mini</w:t>
-      </w:r>
-      <w:r>
-        <w:rPr>
-          <w:rFonts w:ascii="Times New Roman" w:hAnsi="Times New Roman" w:eastAsia="Times New Roman"/>
-          <w:sz w:val="24"/>
-        </w:rPr>
-        <w:t>. The OpenRouter response usage fields include prompt, completion and total tokens and may include a cost value (OpenRouter, n.d.). The local log recorded:</w:t>
+        <w:t>Two subsequent successful requests used openai/gpt-4o-mini. Their non-content metadata are documented in docs/REQUEST_USAGE_EVIDENCE_EN.md; costs are service-returned usage.cost values, not price estimates (OpenRouter, n.d.).</w:t>
       </w:r>
     </w:p>
     <w:tbl>
@@ -1293,7 +835,7 @@
         </w:trPr>
         <w:tc>
           <w:tcPr>
-            <w:tcW w:type="dxa" w:w="1800"/>
+            <w:tcW w:type="dxa" w:w="2088"/>
             <w:vAlign w:val="center"/>
             <w:tcMar>
               <w:top w:w="110" w:type="dxa"/>
@@ -1301,7 +843,7 @@
               <w:bottom w:w="110" w:type="dxa"/>
               <w:end w:w="120" w:type="dxa"/>
             </w:tcMar>
-            <w:shd w:fill="123E43"/>
+            <w:shd w:fill="263C50"/>
           </w:tcPr>
           <w:p>
             <w:pPr>
@@ -1314,13 +856,13 @@
                 <w:color w:val="FFFFFF"/>
                 <w:sz w:val="21"/>
               </w:rPr>
-              <w:t>Request date</w:t>
+              <w:t>Date in 2026</w:t>
             </w:r>
           </w:p>
         </w:tc>
         <w:tc>
           <w:tcPr>
-            <w:tcW w:type="dxa" w:w="2664"/>
+            <w:tcW w:type="dxa" w:w="2592"/>
             <w:vAlign w:val="center"/>
             <w:tcMar>
               <w:top w:w="110" w:type="dxa"/>
@@ -1328,7 +870,7 @@
               <w:bottom w:w="110" w:type="dxa"/>
               <w:end w:w="120" w:type="dxa"/>
             </w:tcMar>
-            <w:shd w:fill="123E43"/>
+            <w:shd w:fill="263C50"/>
           </w:tcPr>
           <w:p>
             <w:pPr>
@@ -1341,13 +883,13 @@
                 <w:color w:val="FFFFFF"/>
                 <w:sz w:val="21"/>
               </w:rPr>
-              <w:t>Input / output / total tokens</w:t>
+              <w:t>Input / output tokens</w:t>
             </w:r>
           </w:p>
         </w:tc>
         <w:tc>
           <w:tcPr>
-            <w:tcW w:type="dxa" w:w="2376"/>
+            <w:tcW w:type="dxa" w:w="2160"/>
             <w:vAlign w:val="center"/>
             <w:tcMar>
               <w:top w:w="110" w:type="dxa"/>
@@ -1355,7 +897,7 @@
               <w:bottom w:w="110" w:type="dxa"/>
               <w:end w:w="120" w:type="dxa"/>
             </w:tcMar>
-            <w:shd w:fill="123E43"/>
+            <w:shd w:fill="263C50"/>
           </w:tcPr>
           <w:p>
             <w:pPr>
@@ -1369,7 +911,7 @@
                 <w:color w:val="FFFFFF"/>
                 <w:sz w:val="21"/>
               </w:rPr>
-              <w:t>Provider-reported cost</w:t>
+              <w:t>Cost in USD</w:t>
             </w:r>
           </w:p>
         </w:tc>
@@ -1383,12 +925,11 @@
               <w:bottom w:w="110" w:type="dxa"/>
               <w:end w:w="120" w:type="dxa"/>
             </w:tcMar>
-            <w:shd w:fill="123E43"/>
+            <w:shd w:fill="263C50"/>
           </w:tcPr>
           <w:p>
             <w:pPr>
               <w:spacing w:after="0" w:line="276" w:lineRule="auto"/>
-              <w:jc w:val="center"/>
             </w:pPr>
             <w:r>
               <w:rPr>
@@ -1397,7 +938,7 @@
                 <w:color w:val="FFFFFF"/>
                 <w:sz w:val="21"/>
               </w:rPr>
-              <w:t>Request-phase latency</w:t>
+              <w:t>Request time</w:t>
             </w:r>
           </w:p>
         </w:tc>
@@ -1408,7 +949,7 @@
         </w:trPr>
         <w:tc>
           <w:tcPr>
-            <w:tcW w:type="dxa" w:w="1800"/>
+            <w:tcW w:type="dxa" w:w="2088"/>
             <w:vAlign w:val="center"/>
             <w:tcMar>
               <w:top w:w="110" w:type="dxa"/>
@@ -1424,15 +965,16 @@
             <w:r>
               <w:rPr>
                 <w:rFonts w:ascii="Times New Roman" w:hAnsi="Times New Roman" w:eastAsia="Times New Roman"/>
+                <w:color w:val="000000"/>
                 <w:sz w:val="21"/>
               </w:rPr>
-              <w:t>30 Sep 2026</w:t>
+              <w:t>30 September</w:t>
             </w:r>
           </w:p>
         </w:tc>
         <w:tc>
           <w:tcPr>
-            <w:tcW w:type="dxa" w:w="2664"/>
+            <w:tcW w:type="dxa" w:w="2592"/>
             <w:vAlign w:val="center"/>
             <w:tcMar>
               <w:top w:w="110" w:type="dxa"/>
@@ -1448,34 +990,10 @@
             <w:r>
               <w:rPr>
                 <w:rFonts w:ascii="Times New Roman" w:hAnsi="Times New Roman" w:eastAsia="Times New Roman"/>
+                <w:color w:val="000000"/>
                 <w:sz w:val="21"/>
               </w:rPr>
-              <w:t>782 / 105 / 887</w:t>
-            </w:r>
-          </w:p>
-        </w:tc>
-        <w:tc>
-          <w:tcPr>
-            <w:tcW w:type="dxa" w:w="2376"/>
-            <w:vAlign w:val="center"/>
-            <w:tcMar>
-              <w:top w:w="110" w:type="dxa"/>
-              <w:start w:w="120" w:type="dxa"/>
-              <w:bottom w:w="110" w:type="dxa"/>
-              <w:end w:w="120" w:type="dxa"/>
-            </w:tcMar>
-          </w:tcPr>
-          <w:p>
-            <w:pPr>
-              <w:spacing w:after="0" w:line="276" w:lineRule="auto"/>
-              <w:jc w:val="center"/>
-            </w:pPr>
-            <w:r>
-              <w:rPr>
-                <w:rFonts w:ascii="Times New Roman" w:hAnsi="Times New Roman" w:eastAsia="Times New Roman"/>
-                <w:sz w:val="21"/>
-              </w:rPr>
-              <w:t>US$0.0001803</w:t>
+              <w:t>782 / 105</w:t>
             </w:r>
           </w:p>
         </w:tc>
@@ -1498,6 +1016,32 @@
             <w:r>
               <w:rPr>
                 <w:rFonts w:ascii="Times New Roman" w:hAnsi="Times New Roman" w:eastAsia="Times New Roman"/>
+                <w:color w:val="000000"/>
+                <w:sz w:val="21"/>
+              </w:rPr>
+              <w:t>0.00018030</w:t>
+            </w:r>
+          </w:p>
+        </w:tc>
+        <w:tc>
+          <w:tcPr>
+            <w:tcW w:type="dxa" w:w="2160"/>
+            <w:vAlign w:val="center"/>
+            <w:tcMar>
+              <w:top w:w="110" w:type="dxa"/>
+              <w:start w:w="120" w:type="dxa"/>
+              <w:bottom w:w="110" w:type="dxa"/>
+              <w:end w:w="120" w:type="dxa"/>
+            </w:tcMar>
+          </w:tcPr>
+          <w:p>
+            <w:pPr>
+              <w:spacing w:after="0" w:line="276" w:lineRule="auto"/>
+            </w:pPr>
+            <w:r>
+              <w:rPr>
+                <w:rFonts w:ascii="Times New Roman" w:hAnsi="Times New Roman" w:eastAsia="Times New Roman"/>
+                <w:color w:val="000000"/>
                 <w:sz w:val="21"/>
               </w:rPr>
               <w:t>3.044005 s</w:t>
@@ -1511,7 +1055,7 @@
         </w:trPr>
         <w:tc>
           <w:tcPr>
-            <w:tcW w:type="dxa" w:w="1800"/>
+            <w:tcW w:type="dxa" w:w="2088"/>
             <w:vAlign w:val="center"/>
             <w:tcMar>
               <w:top w:w="110" w:type="dxa"/>
@@ -1519,7 +1063,7 @@
               <w:bottom w:w="110" w:type="dxa"/>
               <w:end w:w="120" w:type="dxa"/>
             </w:tcMar>
-            <w:shd w:fill="EEF5F4"/>
+            <w:shd w:fill="F2F4F6"/>
           </w:tcPr>
           <w:p>
             <w:pPr>
@@ -1528,15 +1072,16 @@
             <w:r>
               <w:rPr>
                 <w:rFonts w:ascii="Times New Roman" w:hAnsi="Times New Roman" w:eastAsia="Times New Roman"/>
+                <w:color w:val="000000"/>
                 <w:sz w:val="21"/>
               </w:rPr>
-              <w:t>1 Oct 2026</w:t>
+              <w:t>1 October</w:t>
             </w:r>
           </w:p>
         </w:tc>
         <w:tc>
           <w:tcPr>
-            <w:tcW w:type="dxa" w:w="2664"/>
+            <w:tcW w:type="dxa" w:w="2592"/>
             <w:vAlign w:val="center"/>
             <w:tcMar>
               <w:top w:w="110" w:type="dxa"/>
@@ -1544,7 +1089,7 @@
               <w:bottom w:w="110" w:type="dxa"/>
               <w:end w:w="120" w:type="dxa"/>
             </w:tcMar>
-            <w:shd w:fill="EEF5F4"/>
+            <w:shd w:fill="F2F4F6"/>
           </w:tcPr>
           <w:p>
             <w:pPr>
@@ -1553,35 +1098,10 @@
             <w:r>
               <w:rPr>
                 <w:rFonts w:ascii="Times New Roman" w:hAnsi="Times New Roman" w:eastAsia="Times New Roman"/>
+                <w:color w:val="000000"/>
                 <w:sz w:val="21"/>
               </w:rPr>
-              <w:t>809 / 173 / 982</w:t>
-            </w:r>
-          </w:p>
-        </w:tc>
-        <w:tc>
-          <w:tcPr>
-            <w:tcW w:type="dxa" w:w="2376"/>
-            <w:vAlign w:val="center"/>
-            <w:tcMar>
-              <w:top w:w="110" w:type="dxa"/>
-              <w:start w:w="120" w:type="dxa"/>
-              <w:bottom w:w="110" w:type="dxa"/>
-              <w:end w:w="120" w:type="dxa"/>
-            </w:tcMar>
-            <w:shd w:fill="EEF5F4"/>
-          </w:tcPr>
-          <w:p>
-            <w:pPr>
-              <w:spacing w:after="0" w:line="276" w:lineRule="auto"/>
-              <w:jc w:val="center"/>
-            </w:pPr>
-            <w:r>
-              <w:rPr>
-                <w:rFonts w:ascii="Times New Roman" w:hAnsi="Times New Roman" w:eastAsia="Times New Roman"/>
-                <w:sz w:val="21"/>
-              </w:rPr>
-              <w:t>US$0.00022515</w:t>
+              <w:t>809 / 173</w:t>
             </w:r>
           </w:p>
         </w:tc>
@@ -1595,7 +1115,7 @@
               <w:bottom w:w="110" w:type="dxa"/>
               <w:end w:w="120" w:type="dxa"/>
             </w:tcMar>
-            <w:shd w:fill="EEF5F4"/>
+            <w:shd w:fill="F2F4F6"/>
           </w:tcPr>
           <w:p>
             <w:pPr>
@@ -1605,6 +1125,33 @@
             <w:r>
               <w:rPr>
                 <w:rFonts w:ascii="Times New Roman" w:hAnsi="Times New Roman" w:eastAsia="Times New Roman"/>
+                <w:color w:val="000000"/>
+                <w:sz w:val="21"/>
+              </w:rPr>
+              <w:t>0.00022515</w:t>
+            </w:r>
+          </w:p>
+        </w:tc>
+        <w:tc>
+          <w:tcPr>
+            <w:tcW w:type="dxa" w:w="2160"/>
+            <w:vAlign w:val="center"/>
+            <w:tcMar>
+              <w:top w:w="110" w:type="dxa"/>
+              <w:start w:w="120" w:type="dxa"/>
+              <w:bottom w:w="110" w:type="dxa"/>
+              <w:end w:w="120" w:type="dxa"/>
+            </w:tcMar>
+            <w:shd w:fill="F2F4F6"/>
+          </w:tcPr>
+          <w:p>
+            <w:pPr>
+              <w:spacing w:after="0" w:line="276" w:lineRule="auto"/>
+            </w:pPr>
+            <w:r>
+              <w:rPr>
+                <w:rFonts w:ascii="Times New Roman" w:hAnsi="Times New Roman" w:eastAsia="Times New Roman"/>
+                <w:color w:val="000000"/>
                 <w:sz w:val="21"/>
               </w:rPr>
               <w:t>3.827186 s</w:t>
@@ -1623,37 +1170,10 @@
       <w:r>
         <w:rPr>
           <w:rFonts w:ascii="Times New Roman" w:hAnsi="Times New Roman" w:eastAsia="Times New Roman"/>
+          <w:color w:val="000000"/>
           <w:sz w:val="24"/>
         </w:rPr>
-        <w:t>Together, the two calls used 1,591 input and 278 output tokens and had a provider-reported cost of US$0.00040545. These observations do not represent the 30-item evaluation, a stable average or a forecast. The recorded latency covers the request phase, not retrieval, model loading or page rendering. The log stores neither claim text nor claim IDs, so it cannot independently identify which development items produced these calls (</w:t>
-      </w:r>
-      <w:r>
-        <w:rPr>
-          <w:rFonts w:ascii="Consolas" w:hAnsi="Consolas" w:eastAsia="Consolas"/>
-          <w:sz w:val="21"/>
-        </w:rPr>
-        <w:t>logs/request_metrics.jsonl</w:t>
-      </w:r>
-      <w:r>
-        <w:rPr>
-          <w:rFonts w:ascii="Times New Roman" w:hAnsi="Times New Roman" w:eastAsia="Times New Roman"/>
-          <w:sz w:val="24"/>
-        </w:rPr>
-        <w:t xml:space="preserve">; </w:t>
-      </w:r>
-      <w:r>
-        <w:rPr>
-          <w:rFonts w:ascii="Consolas" w:hAnsi="Consolas" w:eastAsia="Consolas"/>
-          <w:sz w:val="21"/>
-        </w:rPr>
-        <w:t>src/usage_logging.py</w:t>
-      </w:r>
-      <w:r>
-        <w:rPr>
-          <w:rFonts w:ascii="Times New Roman" w:hAnsi="Times New Roman" w:eastAsia="Times New Roman"/>
-          <w:sz w:val="24"/>
-        </w:rPr>
-        <w:t>).</w:t>
+        <w:t>Together, these calls used 1,869 tokens and cost US$0.00040545. Two observations cannot establish stable operating cost or the cost of the historical 30-item evaluation. Timings include HTTP handling and response validation, but exclude model loading, retrieval and page rendering. The logs contain no claim IDs, preventing independent mapping to particular development items.</w:t>
       </w:r>
     </w:p>
     <w:p>
@@ -1661,37 +1181,21 @@
       <w:r>
         <w:rPr>
           <w:rFonts w:ascii="Times New Roman" w:hAnsi="Times New Roman" w:eastAsia="Times New Roman"/>
+          <w:color w:val="000000"/>
           <w:sz w:val="24"/>
         </w:rPr>
-        <w:t>The application sends the claim and retrieved case text to an external model service; omitting text from local logs does not keep request content on-device (</w:t>
+        <w:t>Claims and retrieved case text leave the device for inference. Local logs omit that text and keys, but this does not remove the external disclosure. Users should exclude confidential content. Labour spent verifying warnings, service charges and maintenance would all enter an operating-cost model; without measured review time, traffic or wages, a return-on-investment calculation would be speculative.</w:t>
       </w:r>
-      <w:r>
-        <w:rPr>
-          <w:rFonts w:ascii="Consolas" w:hAnsi="Consolas" w:eastAsia="Consolas"/>
-          <w:sz w:val="21"/>
-        </w:rPr>
-        <w:t>src/risk_pipeline.py</w:t>
-      </w:r>
+    </w:p>
+    <w:p>
+      <w:pPr/>
       <w:r>
         <w:rPr>
           <w:rFonts w:ascii="Times New Roman" w:hAnsi="Times New Roman" w:eastAsia="Times New Roman"/>
+          <w:color w:val="000000"/>
           <w:sz w:val="24"/>
         </w:rPr>
-        <w:t xml:space="preserve">; </w:t>
-      </w:r>
-      <w:r>
-        <w:rPr>
-          <w:rFonts w:ascii="Consolas" w:hAnsi="Consolas" w:eastAsia="Consolas"/>
-          <w:sz w:val="21"/>
-        </w:rPr>
-        <w:t>src/llm_client.py</w:t>
-      </w:r>
-      <w:r>
-        <w:rPr>
-          <w:rFonts w:ascii="Times New Roman" w:hAnsi="Times New Roman" w:eastAsia="Times New Roman"/>
-          <w:sz w:val="24"/>
-        </w:rPr>
-        <w:t>). Users should not submit secrets or sensitive commercial information. Without measured seller traffic, wage data or timed review observations, I cannot calculate return on investment or claim a net time saving. The evidence supports a working prototype, not a production compliance service. Any model or threshold change should be tested on new, independently labelled claims; the locked set should remain untouched.</w:t>
+        <w:t>The next evaluation should compare retrieval models and threshold settings on development data, freeze the selected version, then test a separately labelled holdout. In parallel, observed seller use should establish whether evidence assembly actually helps reviewers. For now, ClaimTrace demonstrates a functioning, testable review workflow, with insufficient evidence for autonomous compliance decisions or business savings.</w:t>
       </w:r>
     </w:p>
     <w:p>
@@ -1701,7 +1205,9 @@
       <w:r>
         <w:rPr>
           <w:rFonts w:ascii="Times New Roman" w:hAnsi="Times New Roman" w:eastAsia="Times New Roman"/>
-          <w:sz w:val="24"/>
+          <w:b/>
+          <w:color w:val="000000"/>
+          <w:sz w:val="28"/>
         </w:rPr>
         <w:t>References</w:t>
       </w:r>
@@ -1711,6 +1217,7 @@
       <w:r>
         <w:rPr>
           <w:rFonts w:ascii="Times New Roman" w:hAnsi="Times New Roman" w:eastAsia="Times New Roman"/>
+          <w:color w:val="000000"/>
           <w:sz w:val="24"/>
         </w:rPr>
         <w:t xml:space="preserve">Sentence Transformers. (n.d.). </w:t>
@@ -1719,6 +1226,7 @@
         <w:rPr>
           <w:rFonts w:ascii="Times New Roman" w:hAnsi="Times New Roman" w:eastAsia="Times New Roman"/>
           <w:i/>
+          <w:color w:val="000000"/>
           <w:sz w:val="24"/>
         </w:rPr>
         <w:t>paraphrase-multilingual-MiniLM-L12-v2 model card</w:t>
@@ -1726,6 +1234,7 @@
       <w:r>
         <w:rPr>
           <w:rFonts w:ascii="Times New Roman" w:hAnsi="Times New Roman" w:eastAsia="Times New Roman"/>
+          <w:color w:val="000000"/>
           <w:sz w:val="24"/>
         </w:rPr>
         <w:t xml:space="preserve">. Hugging Face. </w:t>
@@ -1746,6 +1255,7 @@
       <w:r>
         <w:rPr>
           <w:rFonts w:ascii="Times New Roman" w:hAnsi="Times New Roman" w:eastAsia="Times New Roman"/>
+          <w:color w:val="000000"/>
           <w:sz w:val="24"/>
         </w:rPr>
         <w:t xml:space="preserve">OpenRouter. (n.d.). </w:t>
@@ -1754,6 +1264,7 @@
         <w:rPr>
           <w:rFonts w:ascii="Times New Roman" w:hAnsi="Times New Roman" w:eastAsia="Times New Roman"/>
           <w:i/>
+          <w:color w:val="000000"/>
           <w:sz w:val="24"/>
         </w:rPr>
         <w:t>API reference</w:t>
@@ -1761,6 +1272,7 @@
       <w:r>
         <w:rPr>
           <w:rFonts w:ascii="Times New Roman" w:hAnsi="Times New Roman" w:eastAsia="Times New Roman"/>
+          <w:color w:val="000000"/>
           <w:sz w:val="24"/>
         </w:rPr>
         <w:t xml:space="preserve">. </w:t>
@@ -1797,6 +1309,7 @@
     <w:r>
       <w:rPr>
         <w:rFonts w:ascii="Times New Roman" w:hAnsi="Times New Roman" w:eastAsia="Times New Roman"/>
+        <w:color w:val="000000"/>
         <w:sz w:val="20"/>
       </w:rPr>
       <w:fldChar w:fldCharType="begin"/>
@@ -2524,9 +2037,6 @@
     <w:rsid w:val="00FC693F"/>
     <w:pPr>
       <w:keepNext/>
-      <w:pBdr>
-        <w:bottom w:val="single" w:sz="8" w:space="4" w:color="4F81BD" w:themeColor="accent1"/>
-      </w:pBdr>
       <w:spacing w:after="240" w:line="240" w:lineRule="auto"/>
       <w:contextualSpacing/>
     </w:pPr>
@@ -3012,9 +2522,6 @@
     <w:qFormat/>
     <w:rsid w:val="00FC693F"/>
     <w:pPr>
-      <w:pBdr>
-        <w:bottom w:val="single" w:sz="4" w:space="4" w:color="4F81BD" w:themeColor="accent1"/>
-      </w:pBdr>
       <w:spacing w:before="200" w:after="280"/>
       <w:ind w:left="936" w:right="936"/>
     </w:pPr>

</xml_diff>

<commit_message>
Prepare English presentation and final project documentation
Add English case summaries and a default English interface, refresh report
and screenshots, document verification, and remove obsolete review files.
</commit_message>
<xml_diff>
--- a/docs/BUSINESS_TECHNICAL_TRADEOFF_EN.docx
+++ b/docs/BUSINESS_TECHNICAL_TRADEOFF_EN.docx
@@ -7,23 +7,11 @@
         <w:pStyle w:val="Title"/>
       </w:pPr>
       <w:r>
-        <w:rPr>
-          <w:rFonts w:ascii="Times New Roman" w:hAnsi="Times New Roman" w:eastAsia="Times New Roman"/>
-          <w:b/>
-          <w:color w:val="000000"/>
-          <w:sz w:val="38"/>
-        </w:rPr>
         <w:t>ClaimTrace Business and Technical Tradeoff Analysis</w:t>
       </w:r>
     </w:p>
     <w:p>
-      <w:pPr/>
       <w:r>
-        <w:rPr>
-          <w:rFonts w:ascii="Times New Roman" w:hAnsi="Times New Roman" w:eastAsia="Times New Roman"/>
-          <w:color w:val="000000"/>
-          <w:sz w:val="24"/>
-        </w:rPr>
         <w:t>Miao Jiaxuan | PE6201</w:t>
       </w:r>
     </w:p>
@@ -32,46 +20,22 @@
         <w:pStyle w:val="Heading1"/>
       </w:pPr>
       <w:r>
-        <w:rPr>
-          <w:rFonts w:ascii="Times New Roman" w:hAnsi="Times New Roman" w:eastAsia="Times New Roman"/>
-          <w:b/>
-          <w:color w:val="000000"/>
-          <w:sz w:val="28"/>
-        </w:rPr>
         <w:t>Problem and intended users</w:t>
       </w:r>
     </w:p>
     <w:p>
-      <w:pPr/>
       <w:r>
-        <w:rPr>
-          <w:rFonts w:ascii="Times New Roman" w:hAnsi="Times New Roman" w:eastAsia="Times New Roman"/>
-          <w:color w:val="000000"/>
-          <w:sz w:val="24"/>
-        </w:rPr>
-        <w:t>ClaimTrace screens Chinese e-commerce advertising claims for small sellers. It combines a rule baseline, related enforcement cases and a model-generated risk card in one interface. The prototype improves access to contextual evidence, but its combined risk-detection recall of 68% falls short of the proposal's 80% target. This limits its usefulness as an automated screening system.</w:t>
+        <w:t>ClaimTrace helps small Chinese e-commerce sellers check advertising claims before publication. It combines keyword rules, public enforcement cases and a model-generated risk card. The system retrieved useful contextual evidence, but achieved 68% combined risk-detection recall against my 80% target. Its strongest current use is preparing evidence for a reviewer; reliable automatic screening needs further development.</w:t>
       </w:r>
     </w:p>
     <w:p>
-      <w:pPr/>
       <w:r>
-        <w:rPr>
-          <w:rFonts w:ascii="Times New Roman" w:hAnsi="Times New Roman" w:eastAsia="Times New Roman"/>
-          <w:color w:val="000000"/>
-          <w:sz w:val="24"/>
-        </w:rPr>
-        <w:t>The problem comes from my previous product-copy editing work. I checked text against a company prohibited-words list, followed by a supervisor's review. I recall spending one to three minutes per item; this was not timed. Small sellers are the intended users, not an interviewed or validated customer segment. The proposed benefit is easier evidence assembly before human review, rather than proven time savings or replacement of that review.</w:t>
+        <w:t>The problem comes from my previous product-copy editing work. I checked text against a company prohibited-words list and then submitted it for supervisor review. I recall spending one to three minutes per item, although I did not time the process. I chose small sellers without dedicated compliance support as the design persona. Seller interviews and measured review times are still needed to test the proposed benefit.</w:t>
       </w:r>
     </w:p>
     <w:p>
-      <w:pPr/>
       <w:r>
-        <w:rPr>
-          <w:rFonts w:ascii="Times New Roman" w:hAnsi="Times New Roman" w:eastAsia="Times New Roman"/>
-          <w:color w:val="000000"/>
-          <w:sz w:val="24"/>
-        </w:rPr>
-        <w:t>Users enter one Chinese claim and receive a screening label, reasoning and retrieved evidence, or an insufficient-evidence response. The tool can identify dangerous medical-effect advertising in ordinary product copy, but offers no professional advice. Low risk is not legal approval, and publication requires human confirmation. A human-review prompt does not assign a reviewer or create a ticket.</w:t>
+        <w:t>A seller enters one Chinese claim and receives a risk label, highlighted wording, reasoning, a cited case and a suggested action. Weak retrieval produces an insufficient-evidence response. The seller remains responsible for arranging review before publication. The tool provides preliminary screening rather than legal approval.</w:t>
       </w:r>
     </w:p>
     <w:p>
@@ -79,57 +43,27 @@
         <w:pStyle w:val="Heading1"/>
       </w:pPr>
       <w:r>
-        <w:rPr>
-          <w:rFonts w:ascii="Times New Roman" w:hAnsi="Times New Roman" w:eastAsia="Times New Roman"/>
-          <w:b/>
-          <w:color w:val="000000"/>
-          <w:sz w:val="28"/>
-        </w:rPr>
         <w:t>Build versus buy and technical choices</w:t>
       </w:r>
     </w:p>
     <w:p>
-      <w:pPr/>
       <w:r>
-        <w:rPr>
-          <w:rFonts w:ascii="Times New Roman" w:hAnsi="Times New Roman" w:eastAsia="Times New Roman"/>
-          <w:color w:val="000000"/>
-          <w:sz w:val="24"/>
-        </w:rPr>
-        <w:t>I built the Streamlit workflow, keyword rules, retrieval orchestration, response validation and evaluation. I reused Python libraries, multilingual embeddings and a hosted foundation model through OpenRouter. Buying model inference avoids training and hosting a language model, but introduces external-service dependence and requires scrutiny of generated reasoning.</w:t>
+        <w:t>I built the rules, retrieval workflow, validation and evaluation, and used Streamlit for the interface. I reused multilingual embeddings and rented model inference through OpenRouter. This gives me control over the task-specific checks while avoiding the infrastructure needed to train and host a language model. The tradeoff is dependence on an external service for availability, data handling and generated reasoning.</w:t>
       </w:r>
     </w:p>
     <w:p>
-      <w:pPr/>
       <w:r>
-        <w:rPr>
-          <w:rFonts w:ascii="Times New Roman" w:hAnsi="Times New Roman" w:eastAsia="Times New Roman"/>
-          <w:color w:val="000000"/>
-          <w:sz w:val="24"/>
-        </w:rPr>
-        <w:t>The current retriever uses paraphrase-multilingual-MiniLM-L12-v2 and cosine similarity (src/retrieval.py). This addresses the teacher's concern about the proposal's English-trained MiniLM over Chinese text. The model card describes multilingual support, not performance on this project (Sentence Transformers, n.d.). With only 30 case records, direct cosine ranking is sufficient for this prototype; FAISS would add infrastructure without a demonstrated requirement. I did not train a classifier or implement an agent because the task follows a fixed retrieval-and-assessment sequence.</w:t>
+        <w:t>The retriever uses paraphrase-multilingual-MiniLM-L12-v2 to embed Chinese claims and 30 case summaries. Cosine similarity ranks the top three cases. Multilingual support fits the input language better than the English-trained model in my original proposal (Sentence Transformers, n.d.). For this small corpus, direct ranking keeps indexing simple. I chose a fixed pipeline because each request follows the same sequence; autonomous planning would add complexity without a clear task benefit.</w:t>
       </w:r>
     </w:p>
     <w:p>
-      <w:pPr/>
       <w:r>
-        <w:rPr>
-          <w:rFonts w:ascii="Times New Roman" w:hAnsi="Times New Roman" w:eastAsia="Times New Roman"/>
-          <w:color w:val="000000"/>
-          <w:sz w:val="24"/>
-        </w:rPr>
-        <w:t>A selected audit reused saved retrieval results for ten Chinese development queries. Seven top-ranked case IDs matched the expected IDs; all ten were manually judged relevant and supportive of a risk reminder (evaluation/retrieval_audit_10.csv). A different ID is not necessarily irrelevant. However, this small, selected audit is neither a controlled embedding comparison nor a general retrieval-accuracy estimate.</w:t>
+        <w:t>Ten selected Chinese development queries were reviewed against saved retrieval results. Seven top-ranked case IDs matched their expected IDs; all ten were judged relevant to a risk reminder. The three different IDs still concerned related issues. This is encouraging evidence for these queries, although the selected sample is small and does not compare alternative embedding models.</w:t>
       </w:r>
     </w:p>
     <w:p>
-      <w:pPr/>
       <w:r>
-        <w:rPr>
-          <w:rFonts w:ascii="Times New Roman" w:hAnsi="Times New Roman" w:eastAsia="Times New Roman"/>
-          <w:color w:val="000000"/>
-          <w:sz w:val="24"/>
-        </w:rPr>
-        <w:t>The provisional threshold of 0.30 permits one model request at or above the score and abstains below it (src/risk_pipeline.py). It has not been calibrated. Pydantic checks response structure; current guards suppress non-verbatim highlighted text and citations whose title-and-URL pair is absent from retrieval. These checks reduce particular output errors, not unsupported reasoning. They were added after the saved evaluation and cannot be credited with improving its metrics. An independent LLM judge was not implemented; the recorded reviews are human assessments.</w:t>
+        <w:t>A provisional similarity threshold of 0.30 controls model access. Lower scores trigger abstention; scores at or above it permit one request. Pydantic validates the response structure. Additional guards require highlighted wording to appear in the input and citation pairs to appear in retrieval. Reviewers must still check whether the cited facts support the reasoning. These guards were added after the saved evaluation, so their effect on predictive quality remains unmeasured.</w:t>
       </w:r>
     </w:p>
     <w:p>
@@ -137,75 +71,62 @@
         <w:pStyle w:val="Heading1"/>
       </w:pPr>
       <w:r>
-        <w:rPr>
-          <w:rFonts w:ascii="Times New Roman" w:hAnsi="Times New Roman" w:eastAsia="Times New Roman"/>
-          <w:b/>
-          <w:color w:val="000000"/>
-          <w:sz w:val="28"/>
-        </w:rPr>
-        <w:t>Evaluation results and their implications</w:t>
+        <w:t>Evaluation results and implications</w:t>
       </w:r>
     </w:p>
     <w:p>
-      <w:pPr/>
       <w:r>
-        <w:rPr>
-          <w:rFonts w:ascii="Times New Roman" w:hAnsi="Times New Roman" w:eastAsia="Times New Roman"/>
-          <w:color w:val="000000"/>
-          <w:sz w:val="24"/>
-        </w:rPr>
-        <w:t>Both systems were evaluated on the same 30 locked items: 12 high_risk, 13 evidence_needed and five low_risk. Reference labels were frozen before testing and are project judgements, not regulator labels. The saved predictions and denominators are in evaluation/test_set_locked.csv, results/test_baseline.csv and results/test_full.csv.</w:t>
+        <w:t>I compared the rules and ClaimTrace on the same 30 locked items: 12 high_risk, 13 evidence_needed and five low_risk. Labels were frozen before testing. The reference set contains 15 case-derived and 15 synthetic claims. Row-level predictions are saved in results/test_baseline.csv and results/test_full.csv, with the fixed inputs in evaluation/test_set_locked.csv.</w:t>
       </w:r>
     </w:p>
     <w:tbl>
       <w:tblPr>
-        <w:tblStyle w:val="TableGrid"/>
         <w:tblW w:type="auto" w:w="0"/>
         <w:jc w:val="center"/>
         <w:tblLayout w:type="fixed"/>
         <w:tblLook w:firstColumn="1" w:firstRow="1" w:lastColumn="0" w:lastRow="0" w:noHBand="0" w:noVBand="1" w:val="04A0"/>
         <w:tblBorders>
-          <w:top w:val="single" w:sz="4" w:space="0" w:color="D9D9D9"/>
-          <w:left w:val="single" w:sz="4" w:space="0" w:color="D9D9D9"/>
-          <w:bottom w:val="single" w:sz="4" w:space="0" w:color="D9D9D9"/>
-          <w:right w:val="single" w:sz="4" w:space="0" w:color="D9D9D9"/>
-          <w:insideH w:val="single" w:sz="4" w:space="0" w:color="D9D9D9"/>
-          <w:insideV w:val="single" w:sz="4" w:space="0" w:color="D9D9D9"/>
+          <w:top w:val="single" w:sz="4" w:color="D9D9D9"/>
+          <w:left w:val="single" w:sz="4" w:color="D9D9D9"/>
+          <w:bottom w:val="single" w:sz="4" w:color="D9D9D9"/>
+          <w:right w:val="single" w:sz="4" w:color="D9D9D9"/>
+          <w:insideH w:val="single" w:sz="4" w:color="D9D9D9"/>
+          <w:insideV w:val="single" w:sz="4" w:color="D9D9D9"/>
         </w:tblBorders>
       </w:tblPr>
       <w:tblGrid>
-        <w:gridCol w:w="2257"/>
-        <w:gridCol w:w="2257"/>
-        <w:gridCol w:w="2257"/>
-        <w:gridCol w:w="2257"/>
+        <w:gridCol w:w="2621"/>
+        <w:gridCol w:w="1930"/>
+        <w:gridCol w:w="2117"/>
+        <w:gridCol w:w="2117"/>
       </w:tblGrid>
       <w:tr>
         <w:trPr>
           <w:cantSplit/>
-          <w:tblHeader w:val="true"/>
+          <w:tblHeader/>
         </w:trPr>
         <w:tc>
           <w:tcPr>
-            <w:tcW w:type="dxa" w:w="2880"/>
+            <w:tcW w:type="dxa" w:w="2621"/>
             <w:vAlign w:val="center"/>
+            <w:shd w:fill="243E50"/>
             <w:tcMar>
-              <w:top w:w="110" w:type="dxa"/>
-              <w:start w:w="120" w:type="dxa"/>
-              <w:bottom w:w="110" w:type="dxa"/>
-              <w:end w:w="120" w:type="dxa"/>
+              <w:top w:w="85" w:type="dxa"/>
+              <w:bottom w:w="85" w:type="dxa"/>
+              <w:left w:w="85" w:type="dxa"/>
+              <w:right w:w="85" w:type="dxa"/>
             </w:tcMar>
-            <w:shd w:fill="263C50"/>
           </w:tcPr>
           <w:p>
             <w:pPr>
-              <w:spacing w:after="0" w:line="276" w:lineRule="auto"/>
+              <w:spacing w:after="60" w:before="60" w:line="252" w:lineRule="auto"/>
+              <w:jc w:val="left"/>
             </w:pPr>
             <w:r>
               <w:rPr>
-                <w:rFonts w:ascii="Times New Roman" w:hAnsi="Times New Roman" w:eastAsia="Times New Roman"/>
                 <w:b/>
                 <w:color w:val="FFFFFF"/>
-                <w:sz w:val="21"/>
+                <w:sz w:val="20"/>
               </w:rPr>
               <w:t>Positive class</w:t>
             </w:r>
@@ -213,26 +134,26 @@
         </w:tc>
         <w:tc>
           <w:tcPr>
-            <w:tcW w:type="dxa" w:w="1728"/>
+            <w:tcW w:type="dxa" w:w="1930"/>
             <w:vAlign w:val="center"/>
+            <w:shd w:fill="243E50"/>
             <w:tcMar>
-              <w:top w:w="110" w:type="dxa"/>
-              <w:start w:w="120" w:type="dxa"/>
-              <w:bottom w:w="110" w:type="dxa"/>
-              <w:end w:w="120" w:type="dxa"/>
+              <w:top w:w="85" w:type="dxa"/>
+              <w:bottom w:w="85" w:type="dxa"/>
+              <w:left w:w="85" w:type="dxa"/>
+              <w:right w:w="85" w:type="dxa"/>
             </w:tcMar>
-            <w:shd w:fill="263C50"/>
           </w:tcPr>
           <w:p>
             <w:pPr>
-              <w:spacing w:after="0" w:line="276" w:lineRule="auto"/>
+              <w:spacing w:after="60" w:before="60" w:line="252" w:lineRule="auto"/>
+              <w:jc w:val="left"/>
             </w:pPr>
             <w:r>
               <w:rPr>
-                <w:rFonts w:ascii="Times New Roman" w:hAnsi="Times New Roman" w:eastAsia="Times New Roman"/>
                 <w:b/>
                 <w:color w:val="FFFFFF"/>
-                <w:sz w:val="21"/>
+                <w:sz w:val="20"/>
               </w:rPr>
               <w:t>System</w:t>
             </w:r>
@@ -240,27 +161,26 @@
         </w:tc>
         <w:tc>
           <w:tcPr>
-            <w:tcW w:type="dxa" w:w="2160"/>
+            <w:tcW w:type="dxa" w:w="2117"/>
             <w:vAlign w:val="center"/>
+            <w:shd w:fill="243E50"/>
             <w:tcMar>
-              <w:top w:w="110" w:type="dxa"/>
-              <w:start w:w="120" w:type="dxa"/>
-              <w:bottom w:w="110" w:type="dxa"/>
-              <w:end w:w="120" w:type="dxa"/>
+              <w:top w:w="85" w:type="dxa"/>
+              <w:bottom w:w="85" w:type="dxa"/>
+              <w:left w:w="85" w:type="dxa"/>
+              <w:right w:w="85" w:type="dxa"/>
             </w:tcMar>
-            <w:shd w:fill="263C50"/>
           </w:tcPr>
           <w:p>
             <w:pPr>
-              <w:spacing w:after="0" w:line="276" w:lineRule="auto"/>
+              <w:spacing w:after="60" w:before="60" w:line="252" w:lineRule="auto"/>
               <w:jc w:val="center"/>
             </w:pPr>
             <w:r>
               <w:rPr>
-                <w:rFonts w:ascii="Times New Roman" w:hAnsi="Times New Roman" w:eastAsia="Times New Roman"/>
                 <w:b/>
                 <w:color w:val="FFFFFF"/>
-                <w:sz w:val="21"/>
+                <w:sz w:val="20"/>
               </w:rPr>
               <w:t>Precision</w:t>
             </w:r>
@@ -268,27 +188,26 @@
         </w:tc>
         <w:tc>
           <w:tcPr>
-            <w:tcW w:type="dxa" w:w="2232"/>
+            <w:tcW w:type="dxa" w:w="2117"/>
             <w:vAlign w:val="center"/>
+            <w:shd w:fill="243E50"/>
             <w:tcMar>
-              <w:top w:w="110" w:type="dxa"/>
-              <w:start w:w="120" w:type="dxa"/>
-              <w:bottom w:w="110" w:type="dxa"/>
-              <w:end w:w="120" w:type="dxa"/>
+              <w:top w:w="85" w:type="dxa"/>
+              <w:bottom w:w="85" w:type="dxa"/>
+              <w:left w:w="85" w:type="dxa"/>
+              <w:right w:w="85" w:type="dxa"/>
             </w:tcMar>
-            <w:shd w:fill="263C50"/>
           </w:tcPr>
           <w:p>
             <w:pPr>
-              <w:spacing w:after="0" w:line="276" w:lineRule="auto"/>
+              <w:spacing w:after="60" w:before="60" w:line="252" w:lineRule="auto"/>
               <w:jc w:val="center"/>
             </w:pPr>
             <w:r>
               <w:rPr>
-                <w:rFonts w:ascii="Times New Roman" w:hAnsi="Times New Roman" w:eastAsia="Times New Roman"/>
                 <w:b/>
                 <w:color w:val="FFFFFF"/>
-                <w:sz w:val="21"/>
+                <w:sz w:val="20"/>
               </w:rPr>
               <w:t>Recall</w:t>
             </w:r>
@@ -301,24 +220,24 @@
         </w:trPr>
         <w:tc>
           <w:tcPr>
-            <w:tcW w:type="dxa" w:w="2880"/>
+            <w:tcW w:type="dxa" w:w="2621"/>
             <w:vAlign w:val="center"/>
+            <w:shd w:fill="FFFFFF"/>
             <w:tcMar>
-              <w:top w:w="110" w:type="dxa"/>
-              <w:start w:w="120" w:type="dxa"/>
-              <w:bottom w:w="110" w:type="dxa"/>
-              <w:end w:w="120" w:type="dxa"/>
+              <w:top w:w="85" w:type="dxa"/>
+              <w:bottom w:w="85" w:type="dxa"/>
+              <w:left w:w="85" w:type="dxa"/>
+              <w:right w:w="85" w:type="dxa"/>
             </w:tcMar>
           </w:tcPr>
           <w:p>
             <w:pPr>
-              <w:spacing w:after="0" w:line="276" w:lineRule="auto"/>
+              <w:spacing w:after="60" w:before="60" w:line="252" w:lineRule="auto"/>
+              <w:jc w:val="left"/>
             </w:pPr>
             <w:r>
               <w:rPr>
-                <w:rFonts w:ascii="Times New Roman" w:hAnsi="Times New Roman" w:eastAsia="Times New Roman"/>
-                <w:color w:val="000000"/>
-                <w:sz w:val="21"/>
+                <w:sz w:val="20"/>
               </w:rPr>
               <w:t>High risk only</w:t>
             </w:r>
@@ -326,24 +245,24 @@
         </w:tc>
         <w:tc>
           <w:tcPr>
-            <w:tcW w:type="dxa" w:w="1728"/>
+            <w:tcW w:type="dxa" w:w="1930"/>
             <w:vAlign w:val="center"/>
+            <w:shd w:fill="FFFFFF"/>
             <w:tcMar>
-              <w:top w:w="110" w:type="dxa"/>
-              <w:start w:w="120" w:type="dxa"/>
-              <w:bottom w:w="110" w:type="dxa"/>
-              <w:end w:w="120" w:type="dxa"/>
+              <w:top w:w="85" w:type="dxa"/>
+              <w:bottom w:w="85" w:type="dxa"/>
+              <w:left w:w="85" w:type="dxa"/>
+              <w:right w:w="85" w:type="dxa"/>
             </w:tcMar>
           </w:tcPr>
           <w:p>
             <w:pPr>
-              <w:spacing w:after="0" w:line="276" w:lineRule="auto"/>
+              <w:spacing w:after="60" w:before="60" w:line="252" w:lineRule="auto"/>
+              <w:jc w:val="left"/>
             </w:pPr>
             <w:r>
               <w:rPr>
-                <w:rFonts w:ascii="Times New Roman" w:hAnsi="Times New Roman" w:eastAsia="Times New Roman"/>
-                <w:color w:val="000000"/>
-                <w:sz w:val="21"/>
+                <w:sz w:val="20"/>
               </w:rPr>
               <w:t>Rule baseline</w:t>
             </w:r>
@@ -351,25 +270,24 @@
         </w:tc>
         <w:tc>
           <w:tcPr>
-            <w:tcW w:type="dxa" w:w="2160"/>
+            <w:tcW w:type="dxa" w:w="2117"/>
             <w:vAlign w:val="center"/>
+            <w:shd w:fill="FFFFFF"/>
             <w:tcMar>
-              <w:top w:w="110" w:type="dxa"/>
-              <w:start w:w="120" w:type="dxa"/>
-              <w:bottom w:w="110" w:type="dxa"/>
-              <w:end w:w="120" w:type="dxa"/>
+              <w:top w:w="85" w:type="dxa"/>
+              <w:bottom w:w="85" w:type="dxa"/>
+              <w:left w:w="85" w:type="dxa"/>
+              <w:right w:w="85" w:type="dxa"/>
             </w:tcMar>
           </w:tcPr>
           <w:p>
             <w:pPr>
-              <w:spacing w:after="0" w:line="276" w:lineRule="auto"/>
+              <w:spacing w:after="60" w:before="60" w:line="252" w:lineRule="auto"/>
               <w:jc w:val="center"/>
             </w:pPr>
             <w:r>
               <w:rPr>
-                <w:rFonts w:ascii="Times New Roman" w:hAnsi="Times New Roman" w:eastAsia="Times New Roman"/>
-                <w:color w:val="000000"/>
-                <w:sz w:val="21"/>
+                <w:sz w:val="20"/>
               </w:rPr>
               <w:t>3/3 = 100%</w:t>
             </w:r>
@@ -377,25 +295,24 @@
         </w:tc>
         <w:tc>
           <w:tcPr>
-            <w:tcW w:type="dxa" w:w="2232"/>
+            <w:tcW w:type="dxa" w:w="2117"/>
             <w:vAlign w:val="center"/>
+            <w:shd w:fill="FFFFFF"/>
             <w:tcMar>
-              <w:top w:w="110" w:type="dxa"/>
-              <w:start w:w="120" w:type="dxa"/>
-              <w:bottom w:w="110" w:type="dxa"/>
-              <w:end w:w="120" w:type="dxa"/>
+              <w:top w:w="85" w:type="dxa"/>
+              <w:bottom w:w="85" w:type="dxa"/>
+              <w:left w:w="85" w:type="dxa"/>
+              <w:right w:w="85" w:type="dxa"/>
             </w:tcMar>
           </w:tcPr>
           <w:p>
             <w:pPr>
-              <w:spacing w:after="0" w:line="276" w:lineRule="auto"/>
+              <w:spacing w:after="60" w:before="60" w:line="252" w:lineRule="auto"/>
               <w:jc w:val="center"/>
             </w:pPr>
             <w:r>
               <w:rPr>
-                <w:rFonts w:ascii="Times New Roman" w:hAnsi="Times New Roman" w:eastAsia="Times New Roman"/>
-                <w:color w:val="000000"/>
-                <w:sz w:val="21"/>
+                <w:sz w:val="20"/>
               </w:rPr>
               <w:t>3/12 = 25%</w:t>
             </w:r>
@@ -408,25 +325,24 @@
         </w:trPr>
         <w:tc>
           <w:tcPr>
-            <w:tcW w:type="dxa" w:w="2880"/>
+            <w:tcW w:type="dxa" w:w="2621"/>
             <w:vAlign w:val="center"/>
+            <w:shd w:fill="F3F5F6"/>
             <w:tcMar>
-              <w:top w:w="110" w:type="dxa"/>
-              <w:start w:w="120" w:type="dxa"/>
-              <w:bottom w:w="110" w:type="dxa"/>
-              <w:end w:w="120" w:type="dxa"/>
+              <w:top w:w="85" w:type="dxa"/>
+              <w:bottom w:w="85" w:type="dxa"/>
+              <w:left w:w="85" w:type="dxa"/>
+              <w:right w:w="85" w:type="dxa"/>
             </w:tcMar>
-            <w:shd w:fill="F2F4F6"/>
           </w:tcPr>
           <w:p>
             <w:pPr>
-              <w:spacing w:after="0" w:line="276" w:lineRule="auto"/>
+              <w:spacing w:after="60" w:before="60" w:line="252" w:lineRule="auto"/>
+              <w:jc w:val="left"/>
             </w:pPr>
             <w:r>
               <w:rPr>
-                <w:rFonts w:ascii="Times New Roman" w:hAnsi="Times New Roman" w:eastAsia="Times New Roman"/>
-                <w:color w:val="000000"/>
-                <w:sz w:val="21"/>
+                <w:sz w:val="20"/>
               </w:rPr>
               <w:t>High risk only</w:t>
             </w:r>
@@ -434,25 +350,24 @@
         </w:tc>
         <w:tc>
           <w:tcPr>
-            <w:tcW w:type="dxa" w:w="1728"/>
+            <w:tcW w:type="dxa" w:w="1930"/>
             <w:vAlign w:val="center"/>
+            <w:shd w:fill="F3F5F6"/>
             <w:tcMar>
-              <w:top w:w="110" w:type="dxa"/>
-              <w:start w:w="120" w:type="dxa"/>
-              <w:bottom w:w="110" w:type="dxa"/>
-              <w:end w:w="120" w:type="dxa"/>
+              <w:top w:w="85" w:type="dxa"/>
+              <w:bottom w:w="85" w:type="dxa"/>
+              <w:left w:w="85" w:type="dxa"/>
+              <w:right w:w="85" w:type="dxa"/>
             </w:tcMar>
-            <w:shd w:fill="F2F4F6"/>
           </w:tcPr>
           <w:p>
             <w:pPr>
-              <w:spacing w:after="0" w:line="276" w:lineRule="auto"/>
+              <w:spacing w:after="60" w:before="60" w:line="252" w:lineRule="auto"/>
+              <w:jc w:val="left"/>
             </w:pPr>
             <w:r>
               <w:rPr>
-                <w:rFonts w:ascii="Times New Roman" w:hAnsi="Times New Roman" w:eastAsia="Times New Roman"/>
-                <w:color w:val="000000"/>
-                <w:sz w:val="21"/>
+                <w:sz w:val="20"/>
               </w:rPr>
               <w:t>ClaimTrace</w:t>
             </w:r>
@@ -460,26 +375,24 @@
         </w:tc>
         <w:tc>
           <w:tcPr>
-            <w:tcW w:type="dxa" w:w="2160"/>
+            <w:tcW w:type="dxa" w:w="2117"/>
             <w:vAlign w:val="center"/>
+            <w:shd w:fill="F3F5F6"/>
             <w:tcMar>
-              <w:top w:w="110" w:type="dxa"/>
-              <w:start w:w="120" w:type="dxa"/>
-              <w:bottom w:w="110" w:type="dxa"/>
-              <w:end w:w="120" w:type="dxa"/>
+              <w:top w:w="85" w:type="dxa"/>
+              <w:bottom w:w="85" w:type="dxa"/>
+              <w:left w:w="85" w:type="dxa"/>
+              <w:right w:w="85" w:type="dxa"/>
             </w:tcMar>
-            <w:shd w:fill="F2F4F6"/>
           </w:tcPr>
           <w:p>
             <w:pPr>
-              <w:spacing w:after="0" w:line="276" w:lineRule="auto"/>
+              <w:spacing w:after="60" w:before="60" w:line="252" w:lineRule="auto"/>
               <w:jc w:val="center"/>
             </w:pPr>
             <w:r>
               <w:rPr>
-                <w:rFonts w:ascii="Times New Roman" w:hAnsi="Times New Roman" w:eastAsia="Times New Roman"/>
-                <w:color w:val="000000"/>
-                <w:sz w:val="21"/>
+                <w:sz w:val="20"/>
               </w:rPr>
               <w:t>10/17 = 58.8%</w:t>
             </w:r>
@@ -487,26 +400,24 @@
         </w:tc>
         <w:tc>
           <w:tcPr>
-            <w:tcW w:type="dxa" w:w="2232"/>
+            <w:tcW w:type="dxa" w:w="2117"/>
             <w:vAlign w:val="center"/>
+            <w:shd w:fill="F3F5F6"/>
             <w:tcMar>
-              <w:top w:w="110" w:type="dxa"/>
-              <w:start w:w="120" w:type="dxa"/>
-              <w:bottom w:w="110" w:type="dxa"/>
-              <w:end w:w="120" w:type="dxa"/>
+              <w:top w:w="85" w:type="dxa"/>
+              <w:bottom w:w="85" w:type="dxa"/>
+              <w:left w:w="85" w:type="dxa"/>
+              <w:right w:w="85" w:type="dxa"/>
             </w:tcMar>
-            <w:shd w:fill="F2F4F6"/>
           </w:tcPr>
           <w:p>
             <w:pPr>
-              <w:spacing w:after="0" w:line="276" w:lineRule="auto"/>
+              <w:spacing w:after="60" w:before="60" w:line="252" w:lineRule="auto"/>
               <w:jc w:val="center"/>
             </w:pPr>
             <w:r>
               <w:rPr>
-                <w:rFonts w:ascii="Times New Roman" w:hAnsi="Times New Roman" w:eastAsia="Times New Roman"/>
-                <w:color w:val="000000"/>
-                <w:sz w:val="21"/>
+                <w:sz w:val="20"/>
               </w:rPr>
               <w:t>10/12 = 83.3%</w:t>
             </w:r>
@@ -519,24 +430,24 @@
         </w:trPr>
         <w:tc>
           <w:tcPr>
-            <w:tcW w:type="dxa" w:w="2880"/>
+            <w:tcW w:type="dxa" w:w="2621"/>
             <w:vAlign w:val="center"/>
+            <w:shd w:fill="FFFFFF"/>
             <w:tcMar>
-              <w:top w:w="110" w:type="dxa"/>
-              <w:start w:w="120" w:type="dxa"/>
-              <w:bottom w:w="110" w:type="dxa"/>
-              <w:end w:w="120" w:type="dxa"/>
+              <w:top w:w="85" w:type="dxa"/>
+              <w:bottom w:w="85" w:type="dxa"/>
+              <w:left w:w="85" w:type="dxa"/>
+              <w:right w:w="85" w:type="dxa"/>
             </w:tcMar>
           </w:tcPr>
           <w:p>
             <w:pPr>
-              <w:spacing w:after="0" w:line="276" w:lineRule="auto"/>
+              <w:spacing w:after="60" w:before="60" w:line="252" w:lineRule="auto"/>
+              <w:jc w:val="left"/>
             </w:pPr>
             <w:r>
               <w:rPr>
-                <w:rFonts w:ascii="Times New Roman" w:hAnsi="Times New Roman" w:eastAsia="Times New Roman"/>
-                <w:color w:val="000000"/>
-                <w:sz w:val="21"/>
+                <w:sz w:val="20"/>
               </w:rPr>
               <w:t>High risk plus evidence needed</w:t>
             </w:r>
@@ -544,24 +455,24 @@
         </w:tc>
         <w:tc>
           <w:tcPr>
-            <w:tcW w:type="dxa" w:w="1728"/>
+            <w:tcW w:type="dxa" w:w="1930"/>
             <w:vAlign w:val="center"/>
+            <w:shd w:fill="FFFFFF"/>
             <w:tcMar>
-              <w:top w:w="110" w:type="dxa"/>
-              <w:start w:w="120" w:type="dxa"/>
-              <w:bottom w:w="110" w:type="dxa"/>
-              <w:end w:w="120" w:type="dxa"/>
+              <w:top w:w="85" w:type="dxa"/>
+              <w:bottom w:w="85" w:type="dxa"/>
+              <w:left w:w="85" w:type="dxa"/>
+              <w:right w:w="85" w:type="dxa"/>
             </w:tcMar>
           </w:tcPr>
           <w:p>
             <w:pPr>
-              <w:spacing w:after="0" w:line="276" w:lineRule="auto"/>
+              <w:spacing w:after="60" w:before="60" w:line="252" w:lineRule="auto"/>
+              <w:jc w:val="left"/>
             </w:pPr>
             <w:r>
               <w:rPr>
-                <w:rFonts w:ascii="Times New Roman" w:hAnsi="Times New Roman" w:eastAsia="Times New Roman"/>
-                <w:color w:val="000000"/>
-                <w:sz w:val="21"/>
+                <w:sz w:val="20"/>
               </w:rPr>
               <w:t>Rule baseline</w:t>
             </w:r>
@@ -569,25 +480,24 @@
         </w:tc>
         <w:tc>
           <w:tcPr>
-            <w:tcW w:type="dxa" w:w="2160"/>
+            <w:tcW w:type="dxa" w:w="2117"/>
             <w:vAlign w:val="center"/>
+            <w:shd w:fill="FFFFFF"/>
             <w:tcMar>
-              <w:top w:w="110" w:type="dxa"/>
-              <w:start w:w="120" w:type="dxa"/>
-              <w:bottom w:w="110" w:type="dxa"/>
-              <w:end w:w="120" w:type="dxa"/>
+              <w:top w:w="85" w:type="dxa"/>
+              <w:bottom w:w="85" w:type="dxa"/>
+              <w:left w:w="85" w:type="dxa"/>
+              <w:right w:w="85" w:type="dxa"/>
             </w:tcMar>
           </w:tcPr>
           <w:p>
             <w:pPr>
-              <w:spacing w:after="0" w:line="276" w:lineRule="auto"/>
+              <w:spacing w:after="60" w:before="60" w:line="252" w:lineRule="auto"/>
               <w:jc w:val="center"/>
             </w:pPr>
             <w:r>
               <w:rPr>
-                <w:rFonts w:ascii="Times New Roman" w:hAnsi="Times New Roman" w:eastAsia="Times New Roman"/>
-                <w:color w:val="000000"/>
-                <w:sz w:val="21"/>
+                <w:sz w:val="20"/>
               </w:rPr>
               <w:t>8/8 = 100%</w:t>
             </w:r>
@@ -595,25 +505,24 @@
         </w:tc>
         <w:tc>
           <w:tcPr>
-            <w:tcW w:type="dxa" w:w="2232"/>
+            <w:tcW w:type="dxa" w:w="2117"/>
             <w:vAlign w:val="center"/>
+            <w:shd w:fill="FFFFFF"/>
             <w:tcMar>
-              <w:top w:w="110" w:type="dxa"/>
-              <w:start w:w="120" w:type="dxa"/>
-              <w:bottom w:w="110" w:type="dxa"/>
-              <w:end w:w="120" w:type="dxa"/>
+              <w:top w:w="85" w:type="dxa"/>
+              <w:bottom w:w="85" w:type="dxa"/>
+              <w:left w:w="85" w:type="dxa"/>
+              <w:right w:w="85" w:type="dxa"/>
             </w:tcMar>
           </w:tcPr>
           <w:p>
             <w:pPr>
-              <w:spacing w:after="0" w:line="276" w:lineRule="auto"/>
+              <w:spacing w:after="60" w:before="60" w:line="252" w:lineRule="auto"/>
               <w:jc w:val="center"/>
             </w:pPr>
             <w:r>
               <w:rPr>
-                <w:rFonts w:ascii="Times New Roman" w:hAnsi="Times New Roman" w:eastAsia="Times New Roman"/>
-                <w:color w:val="000000"/>
-                <w:sz w:val="21"/>
+                <w:sz w:val="20"/>
               </w:rPr>
               <w:t>8/25 = 32%</w:t>
             </w:r>
@@ -626,25 +535,24 @@
         </w:trPr>
         <w:tc>
           <w:tcPr>
-            <w:tcW w:type="dxa" w:w="2880"/>
+            <w:tcW w:type="dxa" w:w="2621"/>
             <w:vAlign w:val="center"/>
+            <w:shd w:fill="F3F5F6"/>
             <w:tcMar>
-              <w:top w:w="110" w:type="dxa"/>
-              <w:start w:w="120" w:type="dxa"/>
-              <w:bottom w:w="110" w:type="dxa"/>
-              <w:end w:w="120" w:type="dxa"/>
+              <w:top w:w="85" w:type="dxa"/>
+              <w:bottom w:w="85" w:type="dxa"/>
+              <w:left w:w="85" w:type="dxa"/>
+              <w:right w:w="85" w:type="dxa"/>
             </w:tcMar>
-            <w:shd w:fill="F2F4F6"/>
           </w:tcPr>
           <w:p>
             <w:pPr>
-              <w:spacing w:after="0" w:line="276" w:lineRule="auto"/>
+              <w:spacing w:after="60" w:before="60" w:line="252" w:lineRule="auto"/>
+              <w:jc w:val="left"/>
             </w:pPr>
             <w:r>
               <w:rPr>
-                <w:rFonts w:ascii="Times New Roman" w:hAnsi="Times New Roman" w:eastAsia="Times New Roman"/>
-                <w:color w:val="000000"/>
-                <w:sz w:val="21"/>
+                <w:sz w:val="20"/>
               </w:rPr>
               <w:t>High risk plus evidence needed</w:t>
             </w:r>
@@ -652,25 +560,24 @@
         </w:tc>
         <w:tc>
           <w:tcPr>
-            <w:tcW w:type="dxa" w:w="1728"/>
+            <w:tcW w:type="dxa" w:w="1930"/>
             <w:vAlign w:val="center"/>
+            <w:shd w:fill="F3F5F6"/>
             <w:tcMar>
-              <w:top w:w="110" w:type="dxa"/>
-              <w:start w:w="120" w:type="dxa"/>
-              <w:bottom w:w="110" w:type="dxa"/>
-              <w:end w:w="120" w:type="dxa"/>
+              <w:top w:w="85" w:type="dxa"/>
+              <w:bottom w:w="85" w:type="dxa"/>
+              <w:left w:w="85" w:type="dxa"/>
+              <w:right w:w="85" w:type="dxa"/>
             </w:tcMar>
-            <w:shd w:fill="F2F4F6"/>
           </w:tcPr>
           <w:p>
             <w:pPr>
-              <w:spacing w:after="0" w:line="276" w:lineRule="auto"/>
+              <w:spacing w:after="60" w:before="60" w:line="252" w:lineRule="auto"/>
+              <w:jc w:val="left"/>
             </w:pPr>
             <w:r>
               <w:rPr>
-                <w:rFonts w:ascii="Times New Roman" w:hAnsi="Times New Roman" w:eastAsia="Times New Roman"/>
-                <w:color w:val="000000"/>
-                <w:sz w:val="21"/>
+                <w:sz w:val="20"/>
               </w:rPr>
               <w:t>ClaimTrace</w:t>
             </w:r>
@@ -678,26 +585,24 @@
         </w:tc>
         <w:tc>
           <w:tcPr>
-            <w:tcW w:type="dxa" w:w="2160"/>
+            <w:tcW w:type="dxa" w:w="2117"/>
             <w:vAlign w:val="center"/>
+            <w:shd w:fill="F3F5F6"/>
             <w:tcMar>
-              <w:top w:w="110" w:type="dxa"/>
-              <w:start w:w="120" w:type="dxa"/>
-              <w:bottom w:w="110" w:type="dxa"/>
-              <w:end w:w="120" w:type="dxa"/>
+              <w:top w:w="85" w:type="dxa"/>
+              <w:bottom w:w="85" w:type="dxa"/>
+              <w:left w:w="85" w:type="dxa"/>
+              <w:right w:w="85" w:type="dxa"/>
             </w:tcMar>
-            <w:shd w:fill="F2F4F6"/>
           </w:tcPr>
           <w:p>
             <w:pPr>
-              <w:spacing w:after="0" w:line="276" w:lineRule="auto"/>
+              <w:spacing w:after="60" w:before="60" w:line="252" w:lineRule="auto"/>
               <w:jc w:val="center"/>
             </w:pPr>
             <w:r>
               <w:rPr>
-                <w:rFonts w:ascii="Times New Roman" w:hAnsi="Times New Roman" w:eastAsia="Times New Roman"/>
-                <w:color w:val="000000"/>
-                <w:sz w:val="21"/>
+                <w:sz w:val="20"/>
               </w:rPr>
               <w:t>17/17 = 100%</w:t>
             </w:r>
@@ -705,26 +610,24 @@
         </w:tc>
         <w:tc>
           <w:tcPr>
-            <w:tcW w:type="dxa" w:w="2232"/>
+            <w:tcW w:type="dxa" w:w="2117"/>
             <w:vAlign w:val="center"/>
+            <w:shd w:fill="F3F5F6"/>
             <w:tcMar>
-              <w:top w:w="110" w:type="dxa"/>
-              <w:start w:w="120" w:type="dxa"/>
-              <w:bottom w:w="110" w:type="dxa"/>
-              <w:end w:w="120" w:type="dxa"/>
+              <w:top w:w="85" w:type="dxa"/>
+              <w:bottom w:w="85" w:type="dxa"/>
+              <w:left w:w="85" w:type="dxa"/>
+              <w:right w:w="85" w:type="dxa"/>
             </w:tcMar>
-            <w:shd w:fill="F2F4F6"/>
           </w:tcPr>
           <w:p>
             <w:pPr>
-              <w:spacing w:after="0" w:line="276" w:lineRule="auto"/>
+              <w:spacing w:after="60" w:before="60" w:line="252" w:lineRule="auto"/>
               <w:jc w:val="center"/>
             </w:pPr>
             <w:r>
               <w:rPr>
-                <w:rFonts w:ascii="Times New Roman" w:hAnsi="Times New Roman" w:eastAsia="Times New Roman"/>
-                <w:color w:val="000000"/>
-                <w:sz w:val="21"/>
+                <w:sz w:val="20"/>
               </w:rPr>
               <w:t>17/25 = 68%</w:t>
             </w:r>
@@ -734,51 +637,27 @@
     </w:tbl>
     <w:p>
       <w:pPr>
-        <w:spacing w:after="20" w:line="240" w:lineRule="auto"/>
+        <w:spacing w:after="0"/>
       </w:pPr>
     </w:p>
     <w:p>
-      <w:pPr/>
       <w:r>
-        <w:rPr>
-          <w:rFonts w:ascii="Times New Roman" w:hAnsi="Times New Roman" w:eastAsia="Times New Roman"/>
-          <w:color w:val="000000"/>
-          <w:sz w:val="24"/>
-        </w:rPr>
-        <w:t>Precision is TP/(TP+FP), and recall is TP/(TP+FN). The proposal's 80% target concerns the combined class. The 83.3% high-risk recall cannot replace the unmet 68% combined result. Abstention is not automatic detection: a positive item returned as insufficient_evidence remains a false negative. ClaimTrace detects more high-risk items than the baseline, but its seven high-risk false positives would require reviewers to distinguish a warning from evidence of wrongdoing.</w:t>
+        <w:t>Precision is TP/(TP+FP), and recall is TP/(TP+FN). My 80% target applies to the combined class. Positive items returned as insufficient_evidence count as missed automatic detections. ClaimTrace finds more risky claims than the rules, but its high-risk precision of 58.8% means seven warnings overstate the reference risk category. This creates additional work for reviewers. With only 12 high-risk positives, one missed item changes recall by 8.3 percentage points.</w:t>
       </w:r>
     </w:p>
     <w:p>
-      <w:pPr/>
       <w:r>
-        <w:rPr>
-          <w:rFonts w:ascii="Times New Roman" w:hAnsi="Times New Roman" w:eastAsia="Times New Roman"/>
-          <w:color w:val="000000"/>
-          <w:sz w:val="24"/>
-        </w:rPr>
-        <w:t>Three-class Macro F1 is 40.5% for the baseline and 48.0% for ClaimTrace, averaging F1 equally across the three reference labels and counting abstentions as misses for their true class (results/test_metrics.csv). ClaimTrace predicted no evidence_needed items despite 13 reference examples. The improvement therefore conceals a class-level failure. One additional miss changes high-risk recall by 8.3 percentage points, illustrating the estimate's sensitivity to this small sample.</w:t>
+        <w:t>Three-class Macro F1 rises from 40.5% to 48.0%, averaging the three reference-class F1 scores equally and counting abstentions as misses. However, ClaimTrace produced zero evidence_needed predictions despite 13 reference examples. This class failure is the most important result: retrieval of a similar enforcement case can encourage a stronger judgement than the current claim supports. Price and performance claims need supporting records before they can be treated as false claims.</w:t>
       </w:r>
     </w:p>
     <w:p>
-      <w:pPr/>
       <w:r>
-        <w:rPr>
-          <w:rFonts w:ascii="Times New Roman" w:hAnsi="Times New Roman" w:eastAsia="Times New Roman"/>
-          <w:color w:val="000000"/>
-          <w:sz w:val="24"/>
-        </w:rPr>
-        <w:t>Coverage is 20/30 (66.7%); abstention is 10/30 (33.3%). Label agreement among assessed items is 13/20 (65%), versus 12/30 (40%) for the baseline, so these percentages are not directly comparable. Case-derived items have 7/14 agreement and 14/15 coverage; synthetic items have 6/6 agreement but only 6/15 coverage. The nine synthetic abstentions prevent interpreting 6/6 as 100% accuracy on new claims (results/test_summary.csv). Case-derived success also does not establish generalisation to unseen cases.</w:t>
+        <w:t>Coverage is 20/30 (66.7%), with ten abstentions. Among assessed items, label agreement is 13/20 (65%), compared with 12/30 (40%) for the rules. These denominators differ. The case-derived group achieves 7/14 agreement and 14/15 coverage. The synthetic group achieves 6/6 agreement with only 6/15 coverage. Its nine abstentions expose limited reach beyond familiar case wording. The case-derived examples also share source material with the corpus, which limits conclusions about unseen cases.</w:t>
       </w:r>
     </w:p>
     <w:p>
-      <w:pPr/>
       <w:r>
-        <w:rPr>
-          <w:rFonts w:ascii="Times New Roman" w:hAnsi="Times New Roman" w:eastAsia="Times New Roman"/>
-          <w:color w:val="000000"/>
-          <w:sz w:val="24"/>
-        </w:rPr>
-        <w:t>Twenty human reviews cover ten items per source group. Citation support is 10/11 among present, assessable citations; nine records are not applicable. This is not overall citation accuracy. Recommendation actionability could not be assessed because historical outputs omit next_action (results/manual_review_summary.csv). Samples are partly synthetic, and no inter-rater reliability estimate is available. These weaknesses call for more independently labelled examples and a new holdout, not adjustments to the locked labels or test-set tuning.</w:t>
+        <w:t>Twenty human reviews cover ten items from each source group. Ten of eleven assessable citations support the warning; nine records have no applicable citation. Historical outputs omit next_action, leaving recommendation actionability unassessed. The evaluation uses human review; an independent LLM judge was not implemented. The partly synthetic sample, incomplete generation records and absence of inter-rater checks constrain reproducibility and label reliability.</w:t>
       </w:r>
     </w:p>
     <w:p>
@@ -786,75 +665,62 @@
         <w:pStyle w:val="Heading1"/>
       </w:pPr>
       <w:r>
-        <w:rPr>
-          <w:rFonts w:ascii="Times New Roman" w:hAnsi="Times New Roman" w:eastAsia="Times New Roman"/>
-          <w:b/>
-          <w:color w:val="000000"/>
-          <w:sz w:val="28"/>
-        </w:rPr>
-        <w:t>Cost privacy and next steps</w:t>
+        <w:t>Cost privacy and future work</w:t>
       </w:r>
     </w:p>
     <w:p>
-      <w:pPr/>
       <w:r>
-        <w:rPr>
-          <w:rFonts w:ascii="Times New Roman" w:hAnsi="Times New Roman" w:eastAsia="Times New Roman"/>
-          <w:color w:val="000000"/>
-          <w:sz w:val="24"/>
-        </w:rPr>
-        <w:t>Two subsequent successful requests used openai/gpt-4o-mini. Their non-content metadata are documented in docs/REQUEST_USAGE_EVIDENCE_EN.md; costs are service-returned usage.cost values, not price estimates (OpenRouter, n.d.).</w:t>
+        <w:t>Two later requests to openai/gpt-4o-mini produced the usage records below. Costs are the service-returned usage.cost values (OpenRouter, n.d.).</w:t>
       </w:r>
     </w:p>
     <w:tbl>
       <w:tblPr>
-        <w:tblStyle w:val="TableGrid"/>
         <w:tblW w:type="auto" w:w="0"/>
         <w:jc w:val="center"/>
         <w:tblLayout w:type="fixed"/>
         <w:tblLook w:firstColumn="1" w:firstRow="1" w:lastColumn="0" w:lastRow="0" w:noHBand="0" w:noVBand="1" w:val="04A0"/>
         <w:tblBorders>
-          <w:top w:val="single" w:sz="4" w:space="0" w:color="D9D9D9"/>
-          <w:left w:val="single" w:sz="4" w:space="0" w:color="D9D9D9"/>
-          <w:bottom w:val="single" w:sz="4" w:space="0" w:color="D9D9D9"/>
-          <w:right w:val="single" w:sz="4" w:space="0" w:color="D9D9D9"/>
-          <w:insideH w:val="single" w:sz="4" w:space="0" w:color="D9D9D9"/>
-          <w:insideV w:val="single" w:sz="4" w:space="0" w:color="D9D9D9"/>
+          <w:top w:val="single" w:sz="4" w:color="D9D9D9"/>
+          <w:left w:val="single" w:sz="4" w:color="D9D9D9"/>
+          <w:bottom w:val="single" w:sz="4" w:color="D9D9D9"/>
+          <w:right w:val="single" w:sz="4" w:color="D9D9D9"/>
+          <w:insideH w:val="single" w:sz="4" w:color="D9D9D9"/>
+          <w:insideV w:val="single" w:sz="4" w:color="D9D9D9"/>
         </w:tblBorders>
       </w:tblPr>
       <w:tblGrid>
-        <w:gridCol w:w="2257"/>
-        <w:gridCol w:w="2257"/>
-        <w:gridCol w:w="2257"/>
-        <w:gridCol w:w="2257"/>
+        <w:gridCol w:w="1901"/>
+        <w:gridCol w:w="2376"/>
+        <w:gridCol w:w="2232"/>
+        <w:gridCol w:w="2275"/>
       </w:tblGrid>
       <w:tr>
         <w:trPr>
           <w:cantSplit/>
-          <w:tblHeader w:val="true"/>
+          <w:tblHeader/>
         </w:trPr>
         <w:tc>
           <w:tcPr>
-            <w:tcW w:type="dxa" w:w="2088"/>
+            <w:tcW w:type="dxa" w:w="1901"/>
             <w:vAlign w:val="center"/>
+            <w:shd w:fill="243E50"/>
             <w:tcMar>
-              <w:top w:w="110" w:type="dxa"/>
-              <w:start w:w="120" w:type="dxa"/>
-              <w:bottom w:w="110" w:type="dxa"/>
-              <w:end w:w="120" w:type="dxa"/>
+              <w:top w:w="85" w:type="dxa"/>
+              <w:bottom w:w="85" w:type="dxa"/>
+              <w:left w:w="85" w:type="dxa"/>
+              <w:right w:w="85" w:type="dxa"/>
             </w:tcMar>
-            <w:shd w:fill="263C50"/>
           </w:tcPr>
           <w:p>
             <w:pPr>
-              <w:spacing w:after="0" w:line="276" w:lineRule="auto"/>
+              <w:spacing w:after="60" w:before="60" w:line="252" w:lineRule="auto"/>
+              <w:jc w:val="left"/>
             </w:pPr>
             <w:r>
               <w:rPr>
-                <w:rFonts w:ascii="Times New Roman" w:hAnsi="Times New Roman" w:eastAsia="Times New Roman"/>
                 <w:b/>
                 <w:color w:val="FFFFFF"/>
-                <w:sz w:val="21"/>
+                <w:sz w:val="20"/>
               </w:rPr>
               <w:t>Date in 2026</w:t>
             </w:r>
@@ -862,26 +728,26 @@
         </w:tc>
         <w:tc>
           <w:tcPr>
-            <w:tcW w:type="dxa" w:w="2592"/>
+            <w:tcW w:type="dxa" w:w="2376"/>
             <w:vAlign w:val="center"/>
+            <w:shd w:fill="243E50"/>
             <w:tcMar>
-              <w:top w:w="110" w:type="dxa"/>
-              <w:start w:w="120" w:type="dxa"/>
-              <w:bottom w:w="110" w:type="dxa"/>
-              <w:end w:w="120" w:type="dxa"/>
+              <w:top w:w="85" w:type="dxa"/>
+              <w:bottom w:w="85" w:type="dxa"/>
+              <w:left w:w="85" w:type="dxa"/>
+              <w:right w:w="85" w:type="dxa"/>
             </w:tcMar>
-            <w:shd w:fill="263C50"/>
           </w:tcPr>
           <w:p>
             <w:pPr>
-              <w:spacing w:after="0" w:line="276" w:lineRule="auto"/>
+              <w:spacing w:after="60" w:before="60" w:line="252" w:lineRule="auto"/>
+              <w:jc w:val="left"/>
             </w:pPr>
             <w:r>
               <w:rPr>
-                <w:rFonts w:ascii="Times New Roman" w:hAnsi="Times New Roman" w:eastAsia="Times New Roman"/>
                 <w:b/>
                 <w:color w:val="FFFFFF"/>
-                <w:sz w:val="21"/>
+                <w:sz w:val="20"/>
               </w:rPr>
               <w:t>Input / output tokens</w:t>
             </w:r>
@@ -889,27 +755,26 @@
         </w:tc>
         <w:tc>
           <w:tcPr>
-            <w:tcW w:type="dxa" w:w="2160"/>
+            <w:tcW w:type="dxa" w:w="2232"/>
             <w:vAlign w:val="center"/>
+            <w:shd w:fill="243E50"/>
             <w:tcMar>
-              <w:top w:w="110" w:type="dxa"/>
-              <w:start w:w="120" w:type="dxa"/>
-              <w:bottom w:w="110" w:type="dxa"/>
-              <w:end w:w="120" w:type="dxa"/>
+              <w:top w:w="85" w:type="dxa"/>
+              <w:bottom w:w="85" w:type="dxa"/>
+              <w:left w:w="85" w:type="dxa"/>
+              <w:right w:w="85" w:type="dxa"/>
             </w:tcMar>
-            <w:shd w:fill="263C50"/>
           </w:tcPr>
           <w:p>
             <w:pPr>
-              <w:spacing w:after="0" w:line="276" w:lineRule="auto"/>
+              <w:spacing w:after="60" w:before="60" w:line="252" w:lineRule="auto"/>
               <w:jc w:val="center"/>
             </w:pPr>
             <w:r>
               <w:rPr>
-                <w:rFonts w:ascii="Times New Roman" w:hAnsi="Times New Roman" w:eastAsia="Times New Roman"/>
                 <w:b/>
                 <w:color w:val="FFFFFF"/>
-                <w:sz w:val="21"/>
+                <w:sz w:val="20"/>
               </w:rPr>
               <w:t>Cost in USD</w:t>
             </w:r>
@@ -917,26 +782,26 @@
         </w:tc>
         <w:tc>
           <w:tcPr>
-            <w:tcW w:type="dxa" w:w="2160"/>
+            <w:tcW w:type="dxa" w:w="2275"/>
             <w:vAlign w:val="center"/>
+            <w:shd w:fill="243E50"/>
             <w:tcMar>
-              <w:top w:w="110" w:type="dxa"/>
-              <w:start w:w="120" w:type="dxa"/>
-              <w:bottom w:w="110" w:type="dxa"/>
-              <w:end w:w="120" w:type="dxa"/>
+              <w:top w:w="85" w:type="dxa"/>
+              <w:bottom w:w="85" w:type="dxa"/>
+              <w:left w:w="85" w:type="dxa"/>
+              <w:right w:w="85" w:type="dxa"/>
             </w:tcMar>
-            <w:shd w:fill="263C50"/>
           </w:tcPr>
           <w:p>
             <w:pPr>
-              <w:spacing w:after="0" w:line="276" w:lineRule="auto"/>
+              <w:spacing w:after="60" w:before="60" w:line="252" w:lineRule="auto"/>
+              <w:jc w:val="center"/>
             </w:pPr>
             <w:r>
               <w:rPr>
-                <w:rFonts w:ascii="Times New Roman" w:hAnsi="Times New Roman" w:eastAsia="Times New Roman"/>
                 <w:b/>
                 <w:color w:val="FFFFFF"/>
-                <w:sz w:val="21"/>
+                <w:sz w:val="20"/>
               </w:rPr>
               <w:t>Request time</w:t>
             </w:r>
@@ -949,24 +814,24 @@
         </w:trPr>
         <w:tc>
           <w:tcPr>
-            <w:tcW w:type="dxa" w:w="2088"/>
+            <w:tcW w:type="dxa" w:w="1901"/>
             <w:vAlign w:val="center"/>
+            <w:shd w:fill="FFFFFF"/>
             <w:tcMar>
-              <w:top w:w="110" w:type="dxa"/>
-              <w:start w:w="120" w:type="dxa"/>
-              <w:bottom w:w="110" w:type="dxa"/>
-              <w:end w:w="120" w:type="dxa"/>
+              <w:top w:w="85" w:type="dxa"/>
+              <w:bottom w:w="85" w:type="dxa"/>
+              <w:left w:w="85" w:type="dxa"/>
+              <w:right w:w="85" w:type="dxa"/>
             </w:tcMar>
           </w:tcPr>
           <w:p>
             <w:pPr>
-              <w:spacing w:after="0" w:line="276" w:lineRule="auto"/>
+              <w:spacing w:after="60" w:before="60" w:line="252" w:lineRule="auto"/>
+              <w:jc w:val="left"/>
             </w:pPr>
             <w:r>
               <w:rPr>
-                <w:rFonts w:ascii="Times New Roman" w:hAnsi="Times New Roman" w:eastAsia="Times New Roman"/>
-                <w:color w:val="000000"/>
-                <w:sz w:val="21"/>
+                <w:sz w:val="20"/>
               </w:rPr>
               <w:t>30 September</w:t>
             </w:r>
@@ -974,24 +839,24 @@
         </w:tc>
         <w:tc>
           <w:tcPr>
-            <w:tcW w:type="dxa" w:w="2592"/>
+            <w:tcW w:type="dxa" w:w="2376"/>
             <w:vAlign w:val="center"/>
+            <w:shd w:fill="FFFFFF"/>
             <w:tcMar>
-              <w:top w:w="110" w:type="dxa"/>
-              <w:start w:w="120" w:type="dxa"/>
-              <w:bottom w:w="110" w:type="dxa"/>
-              <w:end w:w="120" w:type="dxa"/>
+              <w:top w:w="85" w:type="dxa"/>
+              <w:bottom w:w="85" w:type="dxa"/>
+              <w:left w:w="85" w:type="dxa"/>
+              <w:right w:w="85" w:type="dxa"/>
             </w:tcMar>
           </w:tcPr>
           <w:p>
             <w:pPr>
-              <w:spacing w:after="0" w:line="276" w:lineRule="auto"/>
+              <w:spacing w:after="60" w:before="60" w:line="252" w:lineRule="auto"/>
+              <w:jc w:val="left"/>
             </w:pPr>
             <w:r>
               <w:rPr>
-                <w:rFonts w:ascii="Times New Roman" w:hAnsi="Times New Roman" w:eastAsia="Times New Roman"/>
-                <w:color w:val="000000"/>
-                <w:sz w:val="21"/>
+                <w:sz w:val="20"/>
               </w:rPr>
               <w:t>782 / 105</w:t>
             </w:r>
@@ -999,25 +864,24 @@
         </w:tc>
         <w:tc>
           <w:tcPr>
-            <w:tcW w:type="dxa" w:w="2160"/>
+            <w:tcW w:type="dxa" w:w="2232"/>
             <w:vAlign w:val="center"/>
+            <w:shd w:fill="FFFFFF"/>
             <w:tcMar>
-              <w:top w:w="110" w:type="dxa"/>
-              <w:start w:w="120" w:type="dxa"/>
-              <w:bottom w:w="110" w:type="dxa"/>
-              <w:end w:w="120" w:type="dxa"/>
+              <w:top w:w="85" w:type="dxa"/>
+              <w:bottom w:w="85" w:type="dxa"/>
+              <w:left w:w="85" w:type="dxa"/>
+              <w:right w:w="85" w:type="dxa"/>
             </w:tcMar>
           </w:tcPr>
           <w:p>
             <w:pPr>
-              <w:spacing w:after="0" w:line="276" w:lineRule="auto"/>
+              <w:spacing w:after="60" w:before="60" w:line="252" w:lineRule="auto"/>
               <w:jc w:val="center"/>
             </w:pPr>
             <w:r>
               <w:rPr>
-                <w:rFonts w:ascii="Times New Roman" w:hAnsi="Times New Roman" w:eastAsia="Times New Roman"/>
-                <w:color w:val="000000"/>
-                <w:sz w:val="21"/>
+                <w:sz w:val="20"/>
               </w:rPr>
               <w:t>0.00018030</w:t>
             </w:r>
@@ -1025,24 +889,24 @@
         </w:tc>
         <w:tc>
           <w:tcPr>
-            <w:tcW w:type="dxa" w:w="2160"/>
+            <w:tcW w:type="dxa" w:w="2275"/>
             <w:vAlign w:val="center"/>
+            <w:shd w:fill="FFFFFF"/>
             <w:tcMar>
-              <w:top w:w="110" w:type="dxa"/>
-              <w:start w:w="120" w:type="dxa"/>
-              <w:bottom w:w="110" w:type="dxa"/>
-              <w:end w:w="120" w:type="dxa"/>
+              <w:top w:w="85" w:type="dxa"/>
+              <w:bottom w:w="85" w:type="dxa"/>
+              <w:left w:w="85" w:type="dxa"/>
+              <w:right w:w="85" w:type="dxa"/>
             </w:tcMar>
           </w:tcPr>
           <w:p>
             <w:pPr>
-              <w:spacing w:after="0" w:line="276" w:lineRule="auto"/>
+              <w:spacing w:after="60" w:before="60" w:line="252" w:lineRule="auto"/>
+              <w:jc w:val="center"/>
             </w:pPr>
             <w:r>
               <w:rPr>
-                <w:rFonts w:ascii="Times New Roman" w:hAnsi="Times New Roman" w:eastAsia="Times New Roman"/>
-                <w:color w:val="000000"/>
-                <w:sz w:val="21"/>
+                <w:sz w:val="20"/>
               </w:rPr>
               <w:t>3.044005 s</w:t>
             </w:r>
@@ -1055,25 +919,24 @@
         </w:trPr>
         <w:tc>
           <w:tcPr>
-            <w:tcW w:type="dxa" w:w="2088"/>
+            <w:tcW w:type="dxa" w:w="1901"/>
             <w:vAlign w:val="center"/>
+            <w:shd w:fill="F3F5F6"/>
             <w:tcMar>
-              <w:top w:w="110" w:type="dxa"/>
-              <w:start w:w="120" w:type="dxa"/>
-              <w:bottom w:w="110" w:type="dxa"/>
-              <w:end w:w="120" w:type="dxa"/>
+              <w:top w:w="85" w:type="dxa"/>
+              <w:bottom w:w="85" w:type="dxa"/>
+              <w:left w:w="85" w:type="dxa"/>
+              <w:right w:w="85" w:type="dxa"/>
             </w:tcMar>
-            <w:shd w:fill="F2F4F6"/>
           </w:tcPr>
           <w:p>
             <w:pPr>
-              <w:spacing w:after="0" w:line="276" w:lineRule="auto"/>
+              <w:spacing w:after="60" w:before="60" w:line="252" w:lineRule="auto"/>
+              <w:jc w:val="left"/>
             </w:pPr>
             <w:r>
               <w:rPr>
-                <w:rFonts w:ascii="Times New Roman" w:hAnsi="Times New Roman" w:eastAsia="Times New Roman"/>
-                <w:color w:val="000000"/>
-                <w:sz w:val="21"/>
+                <w:sz w:val="20"/>
               </w:rPr>
               <w:t>1 October</w:t>
             </w:r>
@@ -1081,25 +944,24 @@
         </w:tc>
         <w:tc>
           <w:tcPr>
-            <w:tcW w:type="dxa" w:w="2592"/>
+            <w:tcW w:type="dxa" w:w="2376"/>
             <w:vAlign w:val="center"/>
+            <w:shd w:fill="F3F5F6"/>
             <w:tcMar>
-              <w:top w:w="110" w:type="dxa"/>
-              <w:start w:w="120" w:type="dxa"/>
-              <w:bottom w:w="110" w:type="dxa"/>
-              <w:end w:w="120" w:type="dxa"/>
+              <w:top w:w="85" w:type="dxa"/>
+              <w:bottom w:w="85" w:type="dxa"/>
+              <w:left w:w="85" w:type="dxa"/>
+              <w:right w:w="85" w:type="dxa"/>
             </w:tcMar>
-            <w:shd w:fill="F2F4F6"/>
           </w:tcPr>
           <w:p>
             <w:pPr>
-              <w:spacing w:after="0" w:line="276" w:lineRule="auto"/>
+              <w:spacing w:after="60" w:before="60" w:line="252" w:lineRule="auto"/>
+              <w:jc w:val="left"/>
             </w:pPr>
             <w:r>
               <w:rPr>
-                <w:rFonts w:ascii="Times New Roman" w:hAnsi="Times New Roman" w:eastAsia="Times New Roman"/>
-                <w:color w:val="000000"/>
-                <w:sz w:val="21"/>
+                <w:sz w:val="20"/>
               </w:rPr>
               <w:t>809 / 173</w:t>
             </w:r>
@@ -1107,26 +969,24 @@
         </w:tc>
         <w:tc>
           <w:tcPr>
-            <w:tcW w:type="dxa" w:w="2160"/>
+            <w:tcW w:type="dxa" w:w="2232"/>
             <w:vAlign w:val="center"/>
+            <w:shd w:fill="F3F5F6"/>
             <w:tcMar>
-              <w:top w:w="110" w:type="dxa"/>
-              <w:start w:w="120" w:type="dxa"/>
-              <w:bottom w:w="110" w:type="dxa"/>
-              <w:end w:w="120" w:type="dxa"/>
+              <w:top w:w="85" w:type="dxa"/>
+              <w:bottom w:w="85" w:type="dxa"/>
+              <w:left w:w="85" w:type="dxa"/>
+              <w:right w:w="85" w:type="dxa"/>
             </w:tcMar>
-            <w:shd w:fill="F2F4F6"/>
           </w:tcPr>
           <w:p>
             <w:pPr>
-              <w:spacing w:after="0" w:line="276" w:lineRule="auto"/>
+              <w:spacing w:after="60" w:before="60" w:line="252" w:lineRule="auto"/>
               <w:jc w:val="center"/>
             </w:pPr>
             <w:r>
               <w:rPr>
-                <w:rFonts w:ascii="Times New Roman" w:hAnsi="Times New Roman" w:eastAsia="Times New Roman"/>
-                <w:color w:val="000000"/>
-                <w:sz w:val="21"/>
+                <w:sz w:val="20"/>
               </w:rPr>
               <w:t>0.00022515</w:t>
             </w:r>
@@ -1134,25 +994,24 @@
         </w:tc>
         <w:tc>
           <w:tcPr>
-            <w:tcW w:type="dxa" w:w="2160"/>
+            <w:tcW w:type="dxa" w:w="2275"/>
             <w:vAlign w:val="center"/>
+            <w:shd w:fill="F3F5F6"/>
             <w:tcMar>
-              <w:top w:w="110" w:type="dxa"/>
-              <w:start w:w="120" w:type="dxa"/>
-              <w:bottom w:w="110" w:type="dxa"/>
-              <w:end w:w="120" w:type="dxa"/>
+              <w:top w:w="85" w:type="dxa"/>
+              <w:bottom w:w="85" w:type="dxa"/>
+              <w:left w:w="85" w:type="dxa"/>
+              <w:right w:w="85" w:type="dxa"/>
             </w:tcMar>
-            <w:shd w:fill="F2F4F6"/>
           </w:tcPr>
           <w:p>
             <w:pPr>
-              <w:spacing w:after="0" w:line="276" w:lineRule="auto"/>
+              <w:spacing w:after="60" w:before="60" w:line="252" w:lineRule="auto"/>
+              <w:jc w:val="center"/>
             </w:pPr>
             <w:r>
               <w:rPr>
-                <w:rFonts w:ascii="Times New Roman" w:hAnsi="Times New Roman" w:eastAsia="Times New Roman"/>
-                <w:color w:val="000000"/>
-                <w:sz w:val="21"/>
+                <w:sz w:val="20"/>
               </w:rPr>
               <w:t>3.827186 s</w:t>
             </w:r>
@@ -1162,40 +1021,22 @@
     </w:tbl>
     <w:p>
       <w:pPr>
-        <w:spacing w:after="20" w:line="240" w:lineRule="auto"/>
+        <w:spacing w:after="0"/>
       </w:pPr>
     </w:p>
     <w:p>
-      <w:pPr/>
       <w:r>
-        <w:rPr>
-          <w:rFonts w:ascii="Times New Roman" w:hAnsi="Times New Roman" w:eastAsia="Times New Roman"/>
-          <w:color w:val="000000"/>
-          <w:sz w:val="24"/>
-        </w:rPr>
-        <w:t>Together, these calls used 1,869 tokens and cost US$0.00040545. Two observations cannot establish stable operating cost or the cost of the historical 30-item evaluation. Timings include HTTP handling and response validation, but exclude model loading, retrieval and page rendering. The logs contain no claim IDs, preventing independent mapping to particular development items.</w:t>
+        <w:t>The two calls total 1,869 tokens and US$0.00040545, averaging about US$0.000203 per observed request. A forecast would multiply input and output token counts by their respective model rates, then add hosting, maintenance and reviewer time. Two observations give only an initial cost indication. Historical evaluation cost was not recorded, and request timing excludes embedding, retrieval and page rendering.</w:t>
       </w:r>
     </w:p>
     <w:p>
-      <w:pPr/>
       <w:r>
-        <w:rPr>
-          <w:rFonts w:ascii="Times New Roman" w:hAnsi="Times New Roman" w:eastAsia="Times New Roman"/>
-          <w:color w:val="000000"/>
-          <w:sz w:val="24"/>
-        </w:rPr>
-        <w:t>Claims and retrieved case text leave the device for inference. Local logs omit that text and keys, but this does not remove the external disclosure. Users should exclude confidential content. Labour spent verifying warnings, service charges and maintenance would all enter an operating-cost model; without measured review time, traffic or wages, a return-on-investment calculation would be speculative.</w:t>
+        <w:t>Claims and case summaries are sent to OpenRouter for inference. The application asks users to exclude confidential content and stores only request metadata locally. External disclosure remains a deployment consideration. Labour could dominate the small inference charge because every publication decision still needs human confirmation; measured review times are therefore necessary for a business case.</w:t>
       </w:r>
     </w:p>
     <w:p>
-      <w:pPr/>
       <w:r>
-        <w:rPr>
-          <w:rFonts w:ascii="Times New Roman" w:hAnsi="Times New Roman" w:eastAsia="Times New Roman"/>
-          <w:color w:val="000000"/>
-          <w:sz w:val="24"/>
-        </w:rPr>
-        <w:t>The next evaluation should compare retrieval models and threshold settings on development data, freeze the selected version, then test a separately labelled holdout. In parallel, observed seller use should establish whether evidence assembly actually helps reviewers. For now, ClaimTrace demonstrates a functioning, testable review workflow, with insufficient evidence for autonomous compliance decisions or business savings.</w:t>
+        <w:t>My next step is to compare retrieval models and thresholds on development data, freeze a version and evaluate a separately labelled holdout. I would prioritise evidence_needed errors and the usefulness of next-action recommendations. Observed seller use should then establish whether the evidence trail reduces review effort enough to justify operating and maintenance costs.</w:t>
       </w:r>
     </w:p>
     <w:p>
@@ -1203,95 +1044,41 @@
         <w:pStyle w:val="Heading1"/>
       </w:pPr>
       <w:r>
-        <w:rPr>
-          <w:rFonts w:ascii="Times New Roman" w:hAnsi="Times New Roman" w:eastAsia="Times New Roman"/>
-          <w:b/>
-          <w:color w:val="000000"/>
-          <w:sz w:val="28"/>
-        </w:rPr>
         <w:t>References</w:t>
       </w:r>
     </w:p>
     <w:p>
-      <w:pPr/>
       <w:r>
-        <w:rPr>
-          <w:rFonts w:ascii="Times New Roman" w:hAnsi="Times New Roman" w:eastAsia="Times New Roman"/>
-          <w:color w:val="000000"/>
-          <w:sz w:val="24"/>
-        </w:rPr>
         <w:t xml:space="preserve">Sentence Transformers. (n.d.). </w:t>
       </w:r>
       <w:r>
         <w:rPr>
-          <w:rFonts w:ascii="Times New Roman" w:hAnsi="Times New Roman" w:eastAsia="Times New Roman"/>
           <w:i/>
-          <w:color w:val="000000"/>
-          <w:sz w:val="24"/>
         </w:rPr>
         <w:t>paraphrase-multilingual-MiniLM-L12-v2 model card</w:t>
       </w:r>
       <w:r>
-        <w:rPr>
-          <w:rFonts w:ascii="Times New Roman" w:hAnsi="Times New Roman" w:eastAsia="Times New Roman"/>
-          <w:color w:val="000000"/>
-          <w:sz w:val="24"/>
-        </w:rPr>
-        <w:t xml:space="preserve">. Hugging Face. </w:t>
+        <w:t>. Hugging Face. https://huggingface.co/sentence-transformers/paraphrase-multilingual-MiniLM-L12-v2</w:t>
       </w:r>
-      <w:hyperlink r:id="rId10">
-        <w:r>
-          <w:rPr>
-            <w:rFonts w:ascii="Times New Roman" w:hAnsi="Times New Roman"/>
-            <w:color w:val="1F4E79"/>
-            <w:u w:val="single"/>
-          </w:rPr>
-          <w:t>Model card</w:t>
-        </w:r>
-      </w:hyperlink>
     </w:p>
     <w:p>
-      <w:pPr/>
       <w:r>
-        <w:rPr>
-          <w:rFonts w:ascii="Times New Roman" w:hAnsi="Times New Roman" w:eastAsia="Times New Roman"/>
-          <w:color w:val="000000"/>
-          <w:sz w:val="24"/>
-        </w:rPr>
         <w:t xml:space="preserve">OpenRouter. (n.d.). </w:t>
       </w:r>
       <w:r>
         <w:rPr>
-          <w:rFonts w:ascii="Times New Roman" w:hAnsi="Times New Roman" w:eastAsia="Times New Roman"/>
           <w:i/>
-          <w:color w:val="000000"/>
-          <w:sz w:val="24"/>
         </w:rPr>
         <w:t>API reference</w:t>
       </w:r>
       <w:r>
-        <w:rPr>
-          <w:rFonts w:ascii="Times New Roman" w:hAnsi="Times New Roman" w:eastAsia="Times New Roman"/>
-          <w:color w:val="000000"/>
-          <w:sz w:val="24"/>
-        </w:rPr>
-        <w:t xml:space="preserve">. </w:t>
+        <w:t>. https://openrouter.ai/docs/api_reference/overview</w:t>
       </w:r>
-      <w:hyperlink r:id="rId11">
-        <w:r>
-          <w:rPr>
-            <w:rFonts w:ascii="Times New Roman" w:hAnsi="Times New Roman"/>
-            <w:color w:val="1F4E79"/>
-            <w:u w:val="single"/>
-          </w:rPr>
-          <w:t>OpenRouter API reference</w:t>
-        </w:r>
-      </w:hyperlink>
     </w:p>
     <w:sectPr>
       <w:footerReference w:type="default" r:id="rId9"/>
       <w:pgSz w:w="11909" w:h="16834"/>
-      <w:pgMar w:top="1440" w:right="1440" w:bottom="1440" w:left="1440" w:header="720" w:footer="720" w:gutter="0"/>
+      <w:pgMar w:top="1123" w:right="1181" w:bottom="1123" w:left="1181" w:header="720" w:footer="720" w:gutter="0"/>
       <w:cols w:space="720"/>
       <w:docGrid w:linePitch="360"/>
     </w:sectPr>
@@ -1687,12 +1474,12 @@
     <w:rsid w:val="00FC693F"/>
     <w:pPr>
       <w:widowControl/>
-      <w:spacing w:line="360" w:lineRule="auto" w:after="120"/>
+      <w:spacing w:line="276" w:lineRule="auto" w:after="140"/>
     </w:pPr>
     <w:rPr>
       <w:rFonts w:ascii="Times New Roman" w:hAnsi="Times New Roman" w:eastAsia="Times New Roman"/>
       <w:color w:val="000000"/>
-      <w:sz w:val="24"/>
+      <w:sz w:val="22"/>
     </w:rPr>
   </w:style>
   <w:style w:type="paragraph" w:styleId="Header">
@@ -1750,7 +1537,7 @@
     <w:pPr>
       <w:keepNext/>
       <w:keepLines/>
-      <w:spacing w:before="280" w:after="120"/>
+      <w:spacing w:before="200" w:after="140" w:line="276" w:lineRule="auto"/>
       <w:outlineLvl w:val="0"/>
     </w:pPr>
     <w:rPr>
@@ -1758,7 +1545,7 @@
       <w:b/>
       <w:bCs/>
       <w:color w:val="000000"/>
-      <w:sz w:val="28"/>
+      <w:sz w:val="24"/>
       <w:szCs w:val="28"/>
     </w:rPr>
   </w:style>
@@ -2037,7 +1824,7 @@
     <w:rsid w:val="00FC693F"/>
     <w:pPr>
       <w:keepNext/>
-      <w:spacing w:after="240" w:line="240" w:lineRule="auto"/>
+      <w:spacing w:after="140" w:line="276" w:lineRule="auto" w:before="0"/>
       <w:contextualSpacing/>
     </w:pPr>
     <w:rPr>
@@ -2046,7 +1833,7 @@
       <w:color w:val="000000"/>
       <w:spacing w:val="5"/>
       <w:kern w:val="28"/>
-      <w:sz w:val="38"/>
+      <w:sz w:val="30"/>
       <w:szCs w:val="52"/>
     </w:rPr>
   </w:style>

</xml_diff>